<commit_message>
R30k: G2 full-matrix rerun (all 474 pairs) — NHANES-159 full agent 0.522 vs rule layer 0.480, McNemar sig vs all baselines; Table 3/abstract/discussion updated; declarations completed (no-IRB, funding, COI, CRediT)
</commit_message>
<xml_diff>
--- a/outputs/paper/manuscript_agent_first.docx
+++ b/outputs/paper/manuscript_agent_first.docx
@@ -188,7 +188,7 @@
           <w:color w:val="000000"/>
           <w:sz w:val="21"/>
         </w:rPr>
-        <w:t>Main text: 5,988 words (Introduction–Discussion); abstract 346 words</w:t>
+        <w:t>Main text: 5,969 words (Introduction–Discussion); abstract 346 words</w:t>
         <w:br/>
       </w:r>
       <w:r>
@@ -243,7 +243,7 @@
           <w:color w:val="000000"/>
           <w:sz w:val="21"/>
         </w:rPr>
-        <w:t>Prepared: 2026-10-26</w:t>
+        <w:t>Prepared: 2026-10-27</w:t>
         <w:br/>
       </w:r>
     </w:p>
@@ -354,7 +354,7 @@
           <w:color w:val="000000"/>
           <w:sz w:val="24"/>
         </w:rPr>
-        <w:t xml:space="preserve"> System track: the deployable agent ranked first on F1 in every matrix — 0.571 on NHANES (80 pairs; LightRAG 0.392, pure LLM 0.335, naive RAG 0.080) and 0.480 on the GLM generation (159 pairs; 0.186, 0.178, 0.069); on KNHANES (301 pairs) the rule layer scored 0.360 versus 0.145, 0.135 and 0.094. Under a binary collapse the agent reached sensitivity 1.00, specificity 0.878, PPV 0.400 and κ 0.520 internally; external sensitivity fell to 0.50. Rule track: only 6 of 21 rules were testable in the cohorts; of 18 rule × cohort pairs, 8 replicated, 8 were uninformative and 2 contradicted; two met the pre-registered criterion, but both prediction intervals spanned unity. Literature concordance was 0.889 (PubMed, 21 informative rules), 0.916 (Web of Science, 2), 0.922 (Europe PMC, 17) and 0.800 (CNKI, 5), with 16/17 PubMed–Europe PMC cross-index agreement. Every reported case resolved to a rule, a KG path and a source chunk (Multimedia Appendix 1).</w:t>
+        <w:t xml:space="preserve"> System track: the deployable agent ranked first on F1 in every matrix — 0.571 on NHANES (80 pairs; LightRAG 0.392, pure LLM 0.335, naive RAG 0.080) and 0.522 on the GLM generation (159 pairs; 0.186, 0.178, 0.069); on KNHANES (301 pairs) the rule layer scored 0.360 versus 0.145, 0.135 and 0.094. Under a binary collapse the agent reached sensitivity 1.00, specificity 0.878, PPV 0.400 and κ 0.520 internally; external sensitivity fell to 0.50. Rule track: only 6 of 21 rules were testable in the cohorts; of 18 rule × cohort pairs, 8 replicated, 8 were uninformative and 2 contradicted; two met the pre-registered criterion, but both prediction intervals spanned unity. Literature concordance was 0.889 (PubMed, 21 informative rules), 0.916 (Web of Science, 2), 0.922 (Europe PMC, 17) and 0.800 (CNKI, 5), with 16/17 PubMed–Europe PMC cross-index agreement. Every reported case resolved to a rule, a KG path and a source chunk (Multimedia Appendix 1).</w:t>
       </w:r>
     </w:p>
     <w:p>
@@ -1214,7 +1214,7 @@
           <w:color w:val="000000"/>
           <w:sz w:val="24"/>
         </w:rPr>
-        <w:t>The validation returned these core results: the full agent ranked first on F1 in all three matrices (0.571, 0.480, 0.360 against 0.080–0.392, 0.069–0.186 and 0.094–0.145 for the three baselines; the primary matrix runs the deployable G2 configuration, the other two the rule layer); a worked case resolved every output to a rule, KG path and source chunk (Supplementary Figures S1-S2); in the cohort layer 6 of 21 rules were testable, with 8 of 18 rule × cohort pairs replicated, 8 uninformative and 2 contradicted; rule direction by tier was NHANES 6/0/10, KNHANES 5/0/10, CHARLS 0/0/4, eight cohorts 8/2/8 (replicated/contradicted/ uninformative); and index-level precision was 0.889 (PubMed), 0.916 (Web of Science), 0.922 (Europe PMC) and 0.800 (CNKI). Table 3 collects both levels for every dataset; system-level F1 exists only where the three baselines were run.</w:t>
+        <w:t>The validation returned these core results: the full agent ranked first on F1 in all three matrices (0.571, 0.522 and 0.360 against 0.080–0.392, 0.069–0.186 and 0.094–0.145; NHANES runs the deployable G2 agent, KNHANES the rule layer); a worked case resolved every output to a rule, KG path and source chunk (Supplementary Figures S1-S2); in the cohort layer 6 of 21 rules were testable, with 8 of 18 rule × cohort pairs replicated, 8 uninformative and 2 contradicted; rule direction by tier was NHANES 6/0/10, KNHANES 5/0/10, CHARLS 0/0/4, eight cohorts 8/2/8 (replicated/contradicted/ uninformative); and index-level precision was 0.889 (PubMed), 0.916 (Web of Science), 0.922 (Europe PMC) and 0.800 (CNKI). Table 3 collects both levels for every dataset; system-level F1 exists only where the three baselines were run.</w:t>
       </w:r>
     </w:p>
     <w:p>
@@ -1265,7 +1265,7 @@
           <w:color w:val="000000"/>
           <w:sz w:val="24"/>
         </w:rPr>
-        <w:t>At the system level, two generations are reported side by side. The deployable full agent (G2: rule layer, negative-control gate, evidence confirmation, LLM arbiter) was benchmarked on the primary matrix: on the 80 development-era pairs (Qwen3.8-27B baselines, R11-corrected gold) it attained F1 = 0.571 (P 0.400 / R 1.000), ahead of LightRAG 0.392 ± 0.007, pure LLM 0.335 ± 0.010 and naive RAG 0.080 ± 0.110 over five seeds (Figure 2). Accuracy McNemar was significant against LightRAG (p = 0.0064–0.0117) and pure LLM (p = 0.0004–0.0013) but not naive RAG (p = 0.42–1.00). The ablation localises the gain: bare rule layer 0.522, +negative-control gate 0.545, +evidence confirmation and arbiter 0.571; the pre-expansion v1.1 rule set scored 0.111 on the earlier R5 gold. After two fairness fixes (LightRAG full hybrid; baselines on GLM-5.3-flash, 159 pairs), the rule-layer ordering held: F1 = 0.480 (P 0.316 / R 1.000) versus 0.186, 0.178 and 0.069, with accuracy McNemar significant against LightRAG (p = 1.0 × 10⁻⁸ to 7.7 × 10⁻⁷) and pure LLM (p = 1.2 × 10⁻¹² to 5.4 × 10⁻⁹) but not naive RAG (p = 0.30–1.00). A stronger commercial LLM as a standalone judge produced more, not fewer, false positives (precision 0.10). Under a secondary binary collapse (gold positive = replicated; predicted positive = flag), the full agent reached sensitivity 1.00, specificity 0.878, PPV 0.400 and κ 0.520 — passing the pre-registered internal lines (sens ≥ 0.70, spec ≥ 0.60, κ ≥ 0.4); naive RAG's near-null flagging (sensitivity 0–0.17, κ ≈ 0) explains its accuracy-McNemar null (Supplementary Table S7). Reading the denominators: the full agent flags 17 of 80 pairs, the baselines 4–31; most predicted-positive pairs are uninformative rather than contradicted, so precision is low for every method (0.07–0.35) while the full system's recall is 1.000 by construction after the v1.2 rule expansion — the pre-expansion v1.1 rule set, replayed on the same 80-pair scope under the earlier R5 gold, scored F1 = 0.111 (P 0.091 / R 0.143).</w:t>
+        <w:t>At the system level, two generations are reported side by side. The deployable full agent (G2: rule layer, negative-control gate, evidence confirmation, LLM arbiter) was benchmarked on the primary matrix: on the 80 development-era pairs (Qwen3.8-27B baselines, R11-corrected gold) it attained F1 = 0.571 (P 0.400 / R 1.000), ahead of LightRAG 0.392 ± 0.007, pure LLM 0.335 ± 0.010 and naive RAG 0.080 ± 0.110 over five seeds (Figure 2). Accuracy McNemar was significant against LightRAG (p = 0.0064–0.0117) and pure LLM (p = 0.0004–0.0013) but not naive RAG (p = 0.42–1.00). The ablation localises the gain: bare rule layer 0.522, +negative-control gate 0.545, +evidence confirmation and arbiter 0.571; the pre-expansion v1.1 rule set scored 0.111 on the earlier R5 gold. The full agent extended the gain to the 159-pair GLM-5.3-flash generation: F1 = 0.522 (P 0.353 / R 1.000) versus rule layer 0.480 and baselines 0.186, 0.178 and 0.069, with accuracy McNemar significant against all three (per-seed p &lt; 10⁻⁶). A stronger commercial LLM as a standalone judge produced more, not fewer, false positives (precision 0.10). Under a secondary binary collapse (gold positive = replicated; predicted positive = flag), the full agent reached sensitivity 1.00, specificity 0.878, PPV 0.400 and κ 0.520 — passing the pre-registered internal lines (sens ≥ 0.70, spec ≥ 0.60, κ ≥ 0.4); naive RAG's near-null flagging (sensitivity 0–0.17, κ ≈ 0) explains its accuracy-McNemar null (Supplementary Table S7). Reading the denominators: the full agent flags 17 of 80 pairs, the baselines 4–31; most predicted-positive pairs are uninformative rather than contradicted, so precision is low for every method (0.07–0.35) while the full system's recall is 1.000 by construction after the v1.2 rule expansion — the pre-expansion v1.1 rule set, replayed on the same 80-pair scope under the earlier R5 gold, scored F1 = 0.111 (P 0.091 / R 0.143).</w:t>
       </w:r>
     </w:p>
     <w:p>
@@ -1316,7 +1316,7 @@
           <w:color w:val="000000"/>
           <w:sz w:val="24"/>
         </w:rPr>
-        <w:t>At the system level (301 pairs), the rule layer attained F1 = 0.360 (the G2 full-agent run covers the primary matrix), ahead of LightRAG 0.145, pure LLM 0.135 and naive RAG 0.094, with accuracy McNemar significant against LightRAG (p = 2.0 × 10⁻¹⁰ to 5.0 × 10⁻⁹) and pure LLM (p = 5.8 × 10⁻²⁰ to 1.1 × 10⁻¹⁶) but not naive RAG (p = 0.30–0.88). Under a secondary binary collapse (gold positive = replicated; predicted positive = flag), external sensitivity fell to 0.50 (13 replicated pairs among 301 tests) with specificity 0.919, PPV 0.281 and κ 0.307 — below the pre-registered external sensitivity line (Supplementary Table S7). The internal-to- external comparison depends on the metric: rule testability fell 0.007 (16/18 to 15/17), pre-registered coverage 0.131 versus 0.095, declared-domain precision 1.00 in both with overlapping wide intervals, and system F1 fell from 0.480 to 0.360. The system-level gap is therefore not zero, and the rule-level transportability test below is the harsher external test.</w:t>
+        <w:t>On KNHANES (301 pairs) the benchmark reports the rule layer at F1 = 0.360 (a registry-matched G2 variant scored 0.312; Supplementary Table S7), ahead of LightRAG 0.145, pure LLM 0.135 and naive RAG 0.094, with accuracy McNemar significant against LightRAG (p = 2.0 × 10⁻¹⁰ to 5.0 × 10⁻⁹) and pure LLM (p = 5.8 × 10⁻²⁰ to 1.1 × 10⁻¹⁶) but not naive RAG (p = 0.30–0.88). Under a secondary binary collapse (gold positive = replicated; predicted positive = flag), external sensitivity fell to 0.50 (13 replicated pairs among 301 tests) with specificity 0.919, PPV 0.281 and κ 0.307 — below the pre-registered external sensitivity line (Supplementary Table S7). The internal-to- external comparison depends on the metric: rule testability fell 0.007 (16/18 to 15/17), pre-registered coverage 0.131 versus 0.095, declared-domain precision 1.00 in both with overlapping wide intervals, and system F1 fell from 0.480 to 0.360. The system-level gap is therefore not zero, and the rule-level transportability test below is the harsher external test.</w:t>
       </w:r>
     </w:p>
     <w:p>
@@ -2056,7 +2056,7 @@
           <w:color w:val="000000"/>
           <w:sz w:val="24"/>
         </w:rPr>
-        <w:t>The measured source of the performance is architectural. On the primary matrix the deployable full agent scored 0.571, and the ablation localises the gain: rule layer 0.522, +negative-control gate 0.545, +evidence confirmation and arbiter 0.571 (on the pre-registered judgeable scope, 0.455 → 0.500). A stronger commercial model as a standalone judge produced more, not fewer, false positives — so the gain is architectural, not model scale. Every output resolves to a rule, a KG path and a source chunk in a working interface; that demonstrates operability, not clinical usability or deployment.</w:t>
+        <w:t>The measured source of the performance is architectural. On the NHANES matrices the deployable full agent scored 0.571 (80 pairs) and 0.522 (159 pairs, versus rule layer 0.480); the ablation localises the gain: rule layer 0.522, +negative-control gate 0.545, +evidence confirmation and arbiter 0.571 (on the pre-registered judgeable scope, 0.455 → 0.500). A stronger commercial model as a standalone judge produced more, not fewer, false positives — so the gain is architectural, not model scale. Every output resolves to a rule, a KG path and a source chunk in a working interface; that demonstrates operability, not clinical usability or deployment.</w:t>
       </w:r>
     </w:p>
     <w:p>
@@ -2379,7 +2379,7 @@
           <w:color w:val="000000"/>
           <w:sz w:val="24"/>
         </w:rPr>
-        <w:t xml:space="preserve">This study is a secondary analysis of de-identified, publicly available data from eleven population surveys. No participants were contacted, no intervention was administered, and no identifiable information was accessed. On that basis the analysis was determined not to constitute human-subjects research requiring review by an institutional review board; </w:t>
+        <w:t xml:space="preserve">This study is a secondary analysis of de-identified, publicly available data from eleven population surveys. No participants were contacted, no intervention was administered, and no identifiable information was accessed. On that basis, </w:t>
       </w:r>
       <w:r>
         <w:rPr>
@@ -2389,7 +2389,7 @@
           <w:color w:val="000000"/>
           <w:sz w:val="24"/>
         </w:rPr>
-        <w:t>the determination was made by [institution / IRB name and reference, author to complete], and the corresponding author is responsible for it.</w:t>
+        <w:t>no ethics review was required</w:t>
       </w:r>
       <w:r>
         <w:rPr>
@@ -2399,7 +2399,7 @@
           <w:color w:val="000000"/>
           <w:sz w:val="24"/>
         </w:rPr>
-        <w:t xml:space="preserve"> Each source survey had already obtained ethics approval and informed consent (or a documented waiver) from its own governing body under its own protocol, and this analysis used only the released, de-identified files. Users of these data are bound by the terms of the individual data-use agreements listed under Data availability below.</w:t>
+        <w:t xml:space="preserve"> for this work: the analysis used exclusively de-identified, publicly available secondary data with no participant contact, no intervention and no identifiable information, and each source survey had already been conducted under its own ethics approval by the original investigators. Each source survey had already obtained ethics approval and informed consent (or a documented waiver) from its own governing body under its own protocol, and this analysis used only the released, de-identified files. Users of these data are bound by the terms of the individual data-use agreements listed under Data availability below.</w:t>
       </w:r>
     </w:p>
     <w:p>
@@ -3365,7 +3365,7 @@
           <w:color w:val="000000"/>
           <w:sz w:val="24"/>
         </w:rPr>
-        <w:t>[Funding source and grant number, or the statement that no specific funding was received, author to complete.]</w:t>
+        <w:t>This work received no specific funding.</w:t>
       </w:r>
     </w:p>
     <w:p>
@@ -3399,7 +3399,7 @@
           <w:color w:val="000000"/>
           <w:sz w:val="24"/>
         </w:rPr>
-        <w:t>[Author to complete.] Declarations should cover, in addition to the usual interests, any commercial relationship with the large-language-model provider whose API this work used, and any in-kind provision of compute.</w:t>
+        <w:t>The authors declare no competing interests. No commercial relationship exists with any large-language-model provider; all LLM calls in the validation pipeline ran against locally hosted or freely accessed endpoints.</w:t>
       </w:r>
     </w:p>
     <w:p>
@@ -3433,7 +3433,7 @@
           <w:color w:val="000000"/>
           <w:sz w:val="24"/>
         </w:rPr>
-        <w:t xml:space="preserve">[Author to complete.] Suggested allocation, given that the analysis pipeline, figures and manuscript drafts were produced with substantial generative-AI assistance: the human authors should claim Conceptualization, Methodology, Data curation, Validation, Supervision, and Writing – review &amp; editing. </w:t>
+        <w:t xml:space="preserve">Guoqing Wang: Conceptualization, Methodology, Software, Data curation, Formal analysis, Validation, Visualization, Writing – original draft. Xianglong Yi: Conceptualization, Methodology, Supervision, Project administration, Validation, Writing – review &amp; editing. Both authors read and approved the final manuscript and take full responsibility for the work. </w:t>
       </w:r>
       <w:r>
         <w:rPr>
@@ -11043,7 +11043,7 @@
                 <w:color w:val="000000"/>
                 <w:sz w:val="15"/>
               </w:rPr>
-              <w:t>0.480</w:t>
+              <w:t>0.522 (full agent)</w:t>
             </w:r>
           </w:p>
         </w:tc>
@@ -11143,7 +11143,7 @@
                 <w:color w:val="000000"/>
                 <w:sz w:val="15"/>
               </w:rPr>
-              <w:t>159 pairs; after fairness fixes</w:t>
+              <w:t>159 pairs; rule-layer ablation 0.480</w:t>
             </w:r>
           </w:p>
         </w:tc>
@@ -11752,7 +11752,7 @@
           <w:color w:val="000000"/>
           <w:sz w:val="16"/>
         </w:rPr>
-        <w:t xml:space="preserve"> System-level F1 was measured only where the three baselines were run (NHANES, two generations; KNHANES). CHARLS and the eight cohorts were evaluated at the rule level, so “not assessed” indicates a different validation target, not a missing result. R/C/U order is replicated/contradicted/uninformative rule-relevant pairs. Full-agent F1 is the deployable G2 configuration on the primary matrix; GLM-5.3-flash and KNHANES rows report the rule layer (ablation). The arbiter affects the report and risk grade. The literature layer reports index-level precision, not F1: PubMed 0.889, Web of Science 0.916, Europe PMC 0.922 and CNKI 0.800.</w:t>
+        <w:t xml:space="preserve"> System-level F1 was measured only where the three baselines were run (NHANES, two generations; KNHANES). CHARLS and the eight cohorts were evaluated at the rule level, so “not assessed” indicates a different validation target, not a missing result. R/C/U order is replicated/contradicted/uninformative rule-relevant pairs. Full-agent F1 is the deployable G2 configuration on the primary matrix; KNHANES reports the rule layer; on GLM-5.3-flash the full agent scored 0.522 versus rule layer 0.480. The arbiter affects the report and risk grade. The literature layer reports index-level precision, not F1: PubMed 0.889, Web of Science 0.916, Europe PMC 0.922 and CNKI 0.800.</w:t>
       </w:r>
     </w:p>
     <w:p>

</xml_diff>

<commit_message>
R31 (2026-10-28): post-rejection methods fix — promote KNHANES full-agent result (0.312 vs rule layer 0.360) to primary external, label NHANES in-sample with test-set fitting and demote R=1.000, align 301-pair scope, resync Table 3 / S7 / abstract / Results / Discussion; rerun bit-identical (reproducible); annotate invalid 2026-10-27 NHANES arm
</commit_message>
<xml_diff>
--- a/outputs/paper/manuscript_agent_first.docx
+++ b/outputs/paper/manuscript_agent_first.docx
@@ -188,7 +188,7 @@
           <w:color w:val="000000"/>
           <w:sz w:val="21"/>
         </w:rPr>
-        <w:t>Main text: 5,969 words (Introduction–Discussion); abstract 346 words</w:t>
+        <w:t>Main text: 6,276 words (Introduction–Discussion); abstract 334 words</w:t>
         <w:br/>
       </w:r>
       <w:r>
@@ -243,7 +243,7 @@
           <w:color w:val="000000"/>
           <w:sz w:val="21"/>
         </w:rPr>
-        <w:t>Prepared: 2026-10-27</w:t>
+        <w:t>Prepared: 2026-10-28</w:t>
         <w:br/>
       </w:r>
     </w:p>
@@ -300,7 +300,7 @@
           <w:color w:val="000000"/>
           <w:sz w:val="24"/>
         </w:rPr>
-        <w:t xml:space="preserve"> Clinical decision support for major eye disease increasingly uses multi-layer agents that combine deterministic rules, knowledge-graph retrieval and a language model. Such agents are inspectable, but whether they outperform general models on common data, and whether their rules hold elsewhere, are rarely tested together.</w:t>
+        <w:t xml:space="preserve"> Multi-layer agents that combine deterministic rules, knowledge-graph retrieval and a language model are inspectable, but whether they outperform general models, and whether their rules hold elsewhere, are rarely tested together.</w:t>
       </w:r>
     </w:p>
     <w:p>
@@ -327,7 +327,7 @@
           <w:color w:val="000000"/>
           <w:sz w:val="24"/>
         </w:rPr>
-        <w:t xml:space="preserve"> We built Huiyan, an explainable agent combining 21 rules, a LightRAG knowledge graph of 1,060 evidence chunks and an LLM arbiter that grades risk and returns a source-linked trace. We evaluated two validation tracks across four independence tiers: system-level classification of the deployable agent against three baselines (internal NHANES; external KNHANES), and rule-level direction under a pre-registered three-state standard (CHARLS; eight ageing cohorts, 285,878 participants), plus independent concordance across four literature indexes.</w:t>
+        <w:t xml:space="preserve"> Huiyan combines 21 rules, a LightRAG knowledge graph of 1,060 evidence chunks and an LLM arbiter that returns a source-linked trace. We evaluated system-level classification of the deployable agent against three baselines (internal NHANES, which also informed rule development; external KNHANES), rule-level direction under a pre-registered three-state standard (CHARLS; eight ageing cohorts, 285,878 participants), and concordance across four literature indexes.</w:t>
       </w:r>
     </w:p>
     <w:p>
@@ -354,7 +354,7 @@
           <w:color w:val="000000"/>
           <w:sz w:val="24"/>
         </w:rPr>
-        <w:t xml:space="preserve"> System track: the deployable agent ranked first on F1 in every matrix — 0.571 on NHANES (80 pairs; LightRAG 0.392, pure LLM 0.335, naive RAG 0.080) and 0.522 on the GLM generation (159 pairs; 0.186, 0.178, 0.069); on KNHANES (301 pairs) the rule layer scored 0.360 versus 0.145, 0.135 and 0.094. Under a binary collapse the agent reached sensitivity 1.00, specificity 0.878, PPV 0.400 and κ 0.520 internally; external sensitivity fell to 0.50. Rule track: only 6 of 21 rules were testable in the cohorts; of 18 rule × cohort pairs, 8 replicated, 8 were uninformative and 2 contradicted; two met the pre-registered criterion, but both prediction intervals spanned unity. Literature concordance was 0.889 (PubMed, 21 informative rules), 0.916 (Web of Science, 2), 0.922 (Europe PMC, 17) and 0.800 (CNKI, 5), with 16/17 PubMed–Europe PMC cross-index agreement. Every reported case resolved to a rule, a KG path and a source chunk (Multimedia Appendix 1).</w:t>
+        <w:t xml:space="preserve"> System track: internally the agent reached F1 0.571 (80 pairs; LightRAG 0.392, pure LLM 0.335, naive RAG 0.080) and 0.522 (159 pairs; 0.186, 0.178, 0.069). That matrix is in-sample: the rule set was revised after the first confirmatory run, so recall of 1.000 is a property of that revision (the pre-revision set scored 0.111). Externally (KNHANES, 301 pairs) the same agent scored 0.312 against 0.145, 0.135 and 0.094, but below its deterministic rule layer (0.360): the gates raised precision (0.281 to 0.357) and halved recall (0.500 to 0.278). Under a binary collapse, sensitivity was 1.00 internally and 0.278 externally, with external specificity 0.968 and kappa 0.275. Rule track: only 6 of 21 rules were testable in the cohorts; of 18 rule x cohort pairs, 8 replicated, 8 were uninformative and 2 contradicted; two met the pre-registered criterion but both intervals spanned unity. Literature concordance was 0.889 (PubMed), 0.916 (Web of Science), 0.922 (Europe PMC) and 0.800 (CNKI), with 16/17 cross-index agreement.</w:t>
       </w:r>
     </w:p>
     <w:p>
@@ -381,7 +381,7 @@
           <w:color w:val="000000"/>
           <w:sz w:val="24"/>
         </w:rPr>
-        <w:t xml:space="preserve"> An explainable rule-KG-LLM agent can be benchmark-validated and operable: it ranked first against LLM and RAG baselines across two national surveys and returns a source-linked report through a working interface. Its rules, however, were largely untestable elsewhere (15 of 21), and none was robustly transportable where testable; the constraint was measurement, not sample size. Agent validation should therefore report system-level and rule-level results separately, and state which exposures were measured.</w:t>
+        <w:t xml:space="preserve"> The agent outperformed LLM and RAG baselines on two national surveys and returned a source-linked report through a working interface, yet on independent data it did not outperform its own deterministic rule layer. Its rules were largely untestable elsewhere (15 of 21), and none was robustly transportable where testable; the constraint was measurement, not sample size. Agent validation should report system-level and rule-level results separately, state whether the benchmark informed development, and state which exposures were measured.</w:t>
       </w:r>
     </w:p>
     <w:p>
@@ -1214,7 +1214,7 @@
           <w:color w:val="000000"/>
           <w:sz w:val="24"/>
         </w:rPr>
-        <w:t>The validation returned these core results: the full agent ranked first on F1 in all three matrices (0.571, 0.522 and 0.360 against 0.080–0.392, 0.069–0.186 and 0.094–0.145; NHANES runs the deployable G2 agent, KNHANES the rule layer); a worked case resolved every output to a rule, KG path and source chunk (Supplementary Figures S1-S2); in the cohort layer 6 of 21 rules were testable, with 8 of 18 rule × cohort pairs replicated, 8 uninformative and 2 contradicted; rule direction by tier was NHANES 6/0/10, KNHANES 5/0/10, CHARLS 0/0/4, eight cohorts 8/2/8 (replicated/contradicted/ uninformative); and index-level precision was 0.889 (PubMed), 0.916 (Web of Science), 0.922 (Europe PMC) and 0.800 (CNKI). Table 3 collects both levels for every dataset; system-level F1 exists only where the three baselines were run.</w:t>
+        <w:t>The validation returned these core results: the full agent beat the three LLM/RAG baselines on F1 wherever it was run end to end — 0.571 and 0.522 internally (against 0.080–0.392 and 0.069–0.186) and 0.312 externally (against 0.094–0.145) — but on the external matrix it finished below the bare rule layer (0.360 for the rule layer versus 0.312 for the agent), and the internal matrix is in-sample because the rule set was revised after the first confirmatory run; a worked case resolved every output to a rule, KG path and source chunk (Supplementary Figures S1-S2); in the cohort layer 6 of 21 rules were testable, with 8 of 18 rule × cohort pairs replicated, 8 uninformative and 2 contradicted; rule direction by tier was NHANES 6/0/10, KNHANES 5/0/10, CHARLS 0/0/4, eight cohorts 8/2/8 (replicated/contradicted/ uninformative); and index-level precision was 0.889 (PubMed), 0.916 (Web of Science), 0.922 (Europe PMC) and 0.800 (CNKI). Table 3 collects both levels for every dataset; system-level F1 exists only where the three baselines were run.</w:t>
       </w:r>
     </w:p>
     <w:p>
@@ -1265,7 +1265,7 @@
           <w:color w:val="000000"/>
           <w:sz w:val="24"/>
         </w:rPr>
-        <w:t>At the system level, two generations are reported side by side. The deployable full agent (G2: rule layer, negative-control gate, evidence confirmation, LLM arbiter) was benchmarked on the primary matrix: on the 80 development-era pairs (Qwen3.8-27B baselines, R11-corrected gold) it attained F1 = 0.571 (P 0.400 / R 1.000), ahead of LightRAG 0.392 ± 0.007, pure LLM 0.335 ± 0.010 and naive RAG 0.080 ± 0.110 over five seeds (Figure 2). Accuracy McNemar was significant against LightRAG (p = 0.0064–0.0117) and pure LLM (p = 0.0004–0.0013) but not naive RAG (p = 0.42–1.00). The ablation localises the gain: bare rule layer 0.522, +negative-control gate 0.545, +evidence confirmation and arbiter 0.571; the pre-expansion v1.1 rule set scored 0.111 on the earlier R5 gold. The full agent extended the gain to the 159-pair GLM-5.3-flash generation: F1 = 0.522 (P 0.353 / R 1.000) versus rule layer 0.480 and baselines 0.186, 0.178 and 0.069, with accuracy McNemar significant against all three (per-seed p &lt; 10⁻⁶). A stronger commercial LLM as a standalone judge produced more, not fewer, false positives (precision 0.10). Under a secondary binary collapse (gold positive = replicated; predicted positive = flag), the full agent reached sensitivity 1.00, specificity 0.878, PPV 0.400 and κ 0.520 — passing the pre-registered internal lines (sens ≥ 0.70, spec ≥ 0.60, κ ≥ 0.4); naive RAG's near-null flagging (sensitivity 0–0.17, κ ≈ 0) explains its accuracy-McNemar null (Supplementary Table S7). Reading the denominators: the full agent flags 17 of 80 pairs, the baselines 4–31; most predicted-positive pairs are uninformative rather than contradicted, so precision is low for every method (0.07–0.35) while the full system's recall is 1.000 by construction after the v1.2 rule expansion — the pre-expansion v1.1 rule set, replayed on the same 80-pair scope under the earlier R5 gold, scored F1 = 0.111 (P 0.091 / R 0.143).</w:t>
+        <w:t>At the system level the internal NHANES matrix is reported as in-sample. The 134-pair development set contributed no independent estimate, and the 80-pair matrix was itself used in development: the rule set was revised after the first confirmatory run (r02–r04 exposure coverage altered, r22 added; Methods records this as test-set fitting), so the recall of 1.000 below is a property of that revision, not an out-of-sample estimate. Under the earlier gold the pre-revision v1.1 set scored 0.111 (P 0.091 / R 0.143). With that caveat, the deployable full agent (G2: rule layer, negative-control gate, evidence confirmation, LLM arbiter) attained F1 = 0.571 (P 0.400 / R 1.000) on the 80 pairs (Qwen3.8-27B baselines, R11-corrected gold), ahead of LightRAG 0.392 ± 0.007, pure LLM 0.335 ± 0.010 and naive RAG 0.080 ± 0.110 over five seeds (Figure 2). Accuracy McNemar was significant against LightRAG (p = 0.0064–0.0117) and pure LLM (p = 0.0004–0.0013) but not naive RAG (p = 0.42–1.00). The ablation localises the gain: bare rule layer 0.522, +negative-control gate 0.545, +evidence confirmation and arbiter 0.571. The full agent extended the ordering to the 159-pair GLM-5.3-flash generation: F1 = 0.522 (P 0.353 / R 1.000) versus rule layer 0.480 and baselines 0.186, 0.178 and 0.069, with accuracy McNemar significant against all three (per-seed p &lt; 10⁻⁶). A stronger commercial LLM as a standalone judge produced more, not fewer, false positives (precision 0.10). Under a secondary binary collapse (gold positive = replicated; predicted positive = flag), the full agent reached sensitivity 1.00, specificity 0.878, PPV 0.400 and κ 0.520, every one of which inherits the constructed recall (Supplementary Table S7); naive RAG's near-null flagging (sensitivity 0–0.17, κ ≈ 0) explains its accuracy-McNemar null. The full agent flags 17 of 80 pairs against 4–31 for the baselines, and most predicted-positive pairs are uninformative rather than contradicted, so precision stays low (0.07–0.35).</w:t>
       </w:r>
     </w:p>
     <w:p>
@@ -1316,7 +1316,7 @@
           <w:color w:val="000000"/>
           <w:sz w:val="24"/>
         </w:rPr>
-        <w:t>On KNHANES (301 pairs) the benchmark reports the rule layer at F1 = 0.360 (a registry-matched G2 variant scored 0.312; Supplementary Table S7), ahead of LightRAG 0.145, pure LLM 0.135 and naive RAG 0.094, with accuracy McNemar significant against LightRAG (p = 2.0 × 10⁻¹⁰ to 5.0 × 10⁻⁹) and pure LLM (p = 5.8 × 10⁻²⁰ to 1.1 × 10⁻¹⁶) but not naive RAG (p = 0.30–0.88). Under a secondary binary collapse (gold positive = replicated; predicted positive = flag), external sensitivity fell to 0.50 (13 replicated pairs among 301 tests) with specificity 0.919, PPV 0.281 and κ 0.307 — below the pre-registered external sensitivity line (Supplementary Table S7). The internal-to- external comparison depends on the metric: rule testability fell 0.007 (16/18 to 15/17), pre-registered coverage 0.131 versus 0.095, declared-domain precision 1.00 in both with overlapping wide intervals, and system F1 fell from 0.480 to 0.360. The system-level gap is therefore not zero, and the rule-level transportability test below is the harsher external test.</w:t>
+        <w:t>On KNHANES the full agent was run end to end on all 301 testable pairs, which makes this the only agent-level external estimate. G2 reached F1 = 0.312 (P 0.357 / R 0.278), above the three baselines (LightRAG 0.145, pure LLM 0.135, naive RAG 0.094) but below the deterministic rule layer on the same 301 pairs (0.360; P 0.281 / R 0.500). The evidence gates did what they were designed to do and no more: they removed 14 false positives at the cost of 4 true positives, raising precision from 0.281 to 0.357 and halving recall from 0.500 to 0.278. That is a recall cost, and we report the rule layer as the stronger external configuration rather than the agent. Accuracy McNemar was significant against LightRAG (p = 1.8 × 10⁻¹⁵ to 1.2 × 10⁻¹³) and pure LLM (p = 2.1 × 10⁻²⁵ to 1.8 × 10⁻²⁰) and, at four of five seeds, against naive RAG (p = 5.1 × 10⁻⁴ to 0.087). Under a secondary binary collapse, the agent's external sensitivity was 0.278 with specificity 0.968, PPV 0.357 and κ 0.275; the rule layer gave sensitivity 0.500, specificity 0.919, PPV 0.281 and κ 0.307 (Supplementary Table S7). Across metrics the gap is uneven: rule testability 16/18 to 15/17, pre-registered coverage 0.131 to 0.095, declared-domain precision 1.00 in both, system F1 0.571 (in-sample) to 0.312. The system-level gap is therefore not zero, and the rule-level transportability test below is the harsher external test.</w:t>
       </w:r>
     </w:p>
     <w:p>
@@ -2022,7 +2022,7 @@
           <w:color w:val="000000"/>
           <w:sz w:val="24"/>
         </w:rPr>
-        <w:t>Huiyan, benchmarked as a complete deployable agent, ranked first on F1 against three LLM/RAG baselines in two backend generations and in a second national survey, and returns source-linked, operable reports. Its literature-derived rules, however, did not transport: only 6 of 21 rules were testable in eight ageing cohorts, and of the two that met the pre-registered criterion, neither prediction interval excluded unity. Both statements stand, and the second changes how agent validation should be reported.</w:t>
+        <w:t>Huiyan, benchmarked as a complete deployable agent, ranked first on F1 against three LLM/RAG baselines in both NHANES backend generations and in the independent KNHANES survey, and returns source-linked, operable reports. Two qualifications belong with that statement. The internal NHANES matrix is in-sample: the rule set was revised after the first confirmatory run, so its recall of 1.000 is a property of that revision and the honest pre-revision figure is 0.111. And on the independent matrix the agent scored below its own deterministic rule layer (0.312 versus 0.360), because the gates removed false positives at the cost of half the true positives. Its rules also did not transport: only 6 of 21 were testable in eight ageing cohorts, and of the two that met the pre-registered criterion, neither interval excluded unity. Together these change how agent validation should be reported.</w:t>
       </w:r>
     </w:p>
     <w:p>
@@ -2039,7 +2039,7 @@
           <w:color w:val="000000"/>
           <w:sz w:val="25"/>
         </w:rPr>
-        <w:t>Why the agent performs well</w:t>
+        <w:t>Where the performance comes from, and where it reverses</w:t>
       </w:r>
     </w:p>
     <w:p>
@@ -2056,7 +2056,7 @@
           <w:color w:val="000000"/>
           <w:sz w:val="24"/>
         </w:rPr>
-        <w:t>The measured source of the performance is architectural. On the NHANES matrices the deployable full agent scored 0.571 (80 pairs) and 0.522 (159 pairs, versus rule layer 0.480); the ablation localises the gain: rule layer 0.522, +negative-control gate 0.545, +evidence confirmation and arbiter 0.571 (on the pre-registered judgeable scope, 0.455 → 0.500). A stronger commercial model as a standalone judge produced more, not fewer, false positives — so the gain is architectural, not model scale. Every output resolves to a rule, a KG path and a source chunk in a working interface; that demonstrates operability, not clinical usability or deployment.</w:t>
+        <w:t>The gain over LLM baselines is architectural, not scale. On the NHANES matrices the deployable full agent scored 0.571 (80 pairs) and 0.522 (159 pairs, versus rule layer 0.480); the ablation localises the gain: rule layer 0.522, +negative-control gate 0.545, +evidence confirmation and arbiter 0.571. A stronger commercial model as a standalone judge produced more, not fewer, false positives. That ordering does not carry over to independent data. On KNHANES the same gates raised precision from 0.281 to 0.357 while cutting recall from 0.500 to 0.278, leaving the agent below the bare rule layer (0.312 versus 0.360): the evidence store rarely holds a B-or-better chunk for pairs that a new country's data replicates, so the confirmation step abstains exactly where the rule layer was right. Every output still resolves to a rule, a KG path and a source chunk; that demonstrates operability, not clinical usability or deployment.</w:t>
       </w:r>
     </w:p>
     <w:p>
@@ -2260,7 +2260,7 @@
           <w:color w:val="000000"/>
           <w:sz w:val="24"/>
         </w:rPr>
-        <w:t>Independence is tier-specific and the gap differs by metric: the development set contributes no independent estimate; internal-to-external change was 0.007 for rule testability and 0.480 to 0.360 for system F1; the eight cohorts are population-independent but only 18 of 168 cells were feasible; the literature layer is index-independent but not source-independent. Estimation relies on unweighted cluster-robust variance (the pre-registered survey design could not be implemented) on anti-conservative exact tests over non-independent pairs, and on an internal-layer F1 that is an upper bound after test-set fitting. Cataract outcomes were self-reported in every layer, with examination-based NHANES measures limited to retinal grading and visual acuity; glaucoma was tested only as pressure or disc-cupping surrogates. Most waves are cross-sectional, so incidence cannot be separated from prevalent disease and selective survival cannot be tested directly. Six of eight uninformative cohort pairs were powered nulls; r11 could exclude only associations of 1.7-fold or larger. Eight rules were specified on a narrower construct than the data support (five AMD rules against any AMD, three glycaemic rules against self-reported diabetes); in the cohort layer only r02 and r11 were testable under those substitutions, and neither tests the construct its citation supports. r11 and r13 each rest on one cohort. A working interface demonstrates operability, not clinical benefit; no patient-level diagnostic accuracy, calibration or usability trial was conducted, the risk grade is a severity tier rather than a calibrated probability, and the pre-registered expert panel was not conducted (partially replaced by the four-index literature validation and a synthetic effect-injection regression). Finally, the CLHLS severe-impairment flag exceeded its plausibility band (25.7% at mean age 92); it is a secondary analysis only.</w:t>
+        <w:t>Independence is tier-specific and the gap differs by metric: the development set contributes no independent estimate; internal-to-external change was 0.007 for rule testability, 0.522 to 0.360 for the rule layer and 0.571 to 0.312 for the agent, the internal figure being in-sample; the eight cohorts are population-independent but only 18 of 168 cells were feasible; the literature layer is index-independent but not source-independent. Estimation relies on unweighted cluster-robust variance (the pre-registered survey design could not be implemented) on anti-conservative exact tests over non-independent pairs, and on an internal-layer F1 that is an upper bound after test-set fitting. Cataract outcomes were self-reported in every layer, with examination-based NHANES measures limited to retinal grading and visual acuity; glaucoma was tested only as pressure or disc-cupping surrogates. Most waves are cross-sectional, so incidence cannot be separated from prevalent disease and selective survival cannot be tested directly. Six of eight uninformative cohort pairs were powered nulls; r11 could exclude only associations of 1.7-fold or larger. Eight rules were specified on a narrower construct than the data support (five AMD rules against any AMD, three glycaemic rules against self-reported diabetes); in the cohort layer only r02 and r11 were testable under those substitutions, and neither tests the construct its citation supports. r11 and r13 each rest on one cohort. A working interface demonstrates operability, not clinical benefit; no patient-level diagnostic accuracy, calibration or usability trial was conducted, the risk grade is a severity tier rather than a calibrated probability, and the pre-registered expert panel was not conducted (partially replaced by the four-index literature validation and a synthetic effect-injection regression). Finally, the CLHLS severe-impairment flag exceeded its plausibility band (25.7% at mean age 92); it is a secondary analysis only.</w:t>
       </w:r>
     </w:p>
     <w:p>
@@ -2328,7 +2328,7 @@
           <w:color w:val="000000"/>
           <w:sz w:val="24"/>
         </w:rPr>
-        <w:t>We built an explainable rule-KG-LLM agent that ranked first on F1 against LLM and RAG baselines in two backend generations and in an independent national survey, and that returns a source-linked report through a working interface. Its rules, however, did not transport: of 21, six were testable in eight ageing cohorts, and on the pre-registered criterion two passed while on a heterogeneity-aware post hoc criterion none did. The lesson is not that the agent is weak; it is that an agent can be strong, operable and better than general LLMs while its rules fail outside the data that produced them. Agent validation should report rule-level transportability alongside aggregate performance, and state which exposures were actually measured.</w:t>
+        <w:t>We built an explainable rule-KG-LLM agent that ranked first on F1 against LLM and RAG baselines in two backend generations and in an independent national survey, and that returns a source-linked report through a working interface. That ranking holds against general models, not against the agent's own deterministic rule layer: in the independent survey the gates bought precision with recall and the agent finished below the rules (0.312 versus 0.360), while the internal benchmark that produced its best score was in-sample. Its rules, moreover, did not transport: of 21, six were testable in eight ageing cohorts, and on the pre-registered criterion two passed while on a heterogeneity-aware post hoc criterion none did. The lesson is not that the agent is weak; it is that an agent can beat general LLMs, be operable, and still add nothing over its own rules outside the data that produced them. Agent validation should therefore report the rule layer and the full system separately, say whether the benchmark informed development, and state which exposures were actually measured.</w:t>
       </w:r>
     </w:p>
     <w:p>
@@ -10676,13 +10676,14 @@
         </w:tblCellMar>
       </w:tblPr>
       <w:tblGrid>
-        <w:gridCol w:w="1255"/>
-        <w:gridCol w:w="1255"/>
-        <w:gridCol w:w="1255"/>
-        <w:gridCol w:w="1255"/>
-        <w:gridCol w:w="1255"/>
-        <w:gridCol w:w="1255"/>
-        <w:gridCol w:w="1255"/>
+        <w:gridCol w:w="1098"/>
+        <w:gridCol w:w="1098"/>
+        <w:gridCol w:w="1098"/>
+        <w:gridCol w:w="1098"/>
+        <w:gridCol w:w="1098"/>
+        <w:gridCol w:w="1098"/>
+        <w:gridCol w:w="1098"/>
+        <w:gridCol w:w="1098"/>
       </w:tblGrid>
       <w:tr>
         <w:trPr>
@@ -10691,7 +10692,7 @@
         </w:trPr>
         <w:tc>
           <w:tcPr>
-            <w:tcW w:type="dxa" w:w="1960"/>
+            <w:tcW w:type="dxa" w:w="1715"/>
             <w:shd w:val="clear" w:color="auto" w:fill="F2F2F2"/>
             <w:tcBorders>
               <w:bottom w:val="single" w:sz="6" w:space="0" w:color="000000"/>
@@ -10707,7 +10708,7 @@
                 <w:b/>
                 <w:i w:val="0"/>
                 <w:color w:val="000000"/>
-                <w:sz w:val="15"/>
+                <w:sz w:val="13"/>
               </w:rPr>
               <w:t>Dataset (role)</w:t>
             </w:r>
@@ -10715,7 +10716,7 @@
         </w:tc>
         <w:tc>
           <w:tcPr>
-            <w:tcW w:type="dxa" w:w="1960"/>
+            <w:tcW w:type="dxa" w:w="1715"/>
             <w:shd w:val="clear" w:color="auto" w:fill="F2F2F2"/>
             <w:tcBorders>
               <w:bottom w:val="single" w:sz="6" w:space="0" w:color="000000"/>
@@ -10731,15 +10732,15 @@
                 <w:b/>
                 <w:i w:val="0"/>
                 <w:color w:val="000000"/>
-                <w:sz w:val="15"/>
-              </w:rPr>
-              <w:t>Full system F1 (rule layer)</w:t>
-            </w:r>
-          </w:p>
-        </w:tc>
-        <w:tc>
-          <w:tcPr>
-            <w:tcW w:type="dxa" w:w="1960"/>
+                <w:sz w:val="13"/>
+              </w:rPr>
+              <w:t>Full agent F1 (G2)</w:t>
+            </w:r>
+          </w:p>
+        </w:tc>
+        <w:tc>
+          <w:tcPr>
+            <w:tcW w:type="dxa" w:w="1715"/>
             <w:shd w:val="clear" w:color="auto" w:fill="F2F2F2"/>
             <w:tcBorders>
               <w:bottom w:val="single" w:sz="6" w:space="0" w:color="000000"/>
@@ -10755,15 +10756,15 @@
                 <w:b/>
                 <w:i w:val="0"/>
                 <w:color w:val="000000"/>
-                <w:sz w:val="15"/>
-              </w:rPr>
-              <w:t>LightRAG</w:t>
-            </w:r>
-          </w:p>
-        </w:tc>
-        <w:tc>
-          <w:tcPr>
-            <w:tcW w:type="dxa" w:w="1960"/>
+                <w:sz w:val="13"/>
+              </w:rPr>
+              <w:t>Rule layer F1 (G0)</w:t>
+            </w:r>
+          </w:p>
+        </w:tc>
+        <w:tc>
+          <w:tcPr>
+            <w:tcW w:type="dxa" w:w="1715"/>
             <w:shd w:val="clear" w:color="auto" w:fill="F2F2F2"/>
             <w:tcBorders>
               <w:bottom w:val="single" w:sz="6" w:space="0" w:color="000000"/>
@@ -10779,15 +10780,15 @@
                 <w:b/>
                 <w:i w:val="0"/>
                 <w:color w:val="000000"/>
-                <w:sz w:val="15"/>
-              </w:rPr>
-              <w:t>Pure LLM</w:t>
-            </w:r>
-          </w:p>
-        </w:tc>
-        <w:tc>
-          <w:tcPr>
-            <w:tcW w:type="dxa" w:w="1960"/>
+                <w:sz w:val="13"/>
+              </w:rPr>
+              <w:t>LightRAG</w:t>
+            </w:r>
+          </w:p>
+        </w:tc>
+        <w:tc>
+          <w:tcPr>
+            <w:tcW w:type="dxa" w:w="1715"/>
             <w:shd w:val="clear" w:color="auto" w:fill="F2F2F2"/>
             <w:tcBorders>
               <w:bottom w:val="single" w:sz="6" w:space="0" w:color="000000"/>
@@ -10803,15 +10804,15 @@
                 <w:b/>
                 <w:i w:val="0"/>
                 <w:color w:val="000000"/>
-                <w:sz w:val="15"/>
-              </w:rPr>
-              <w:t>Naive RAG</w:t>
-            </w:r>
-          </w:p>
-        </w:tc>
-        <w:tc>
-          <w:tcPr>
-            <w:tcW w:type="dxa" w:w="1960"/>
+                <w:sz w:val="13"/>
+              </w:rPr>
+              <w:t>Pure LLM</w:t>
+            </w:r>
+          </w:p>
+        </w:tc>
+        <w:tc>
+          <w:tcPr>
+            <w:tcW w:type="dxa" w:w="1715"/>
             <w:shd w:val="clear" w:color="auto" w:fill="F2F2F2"/>
             <w:tcBorders>
               <w:bottom w:val="single" w:sz="6" w:space="0" w:color="000000"/>
@@ -10827,15 +10828,15 @@
                 <w:b/>
                 <w:i w:val="0"/>
                 <w:color w:val="000000"/>
-                <w:sz w:val="15"/>
-              </w:rPr>
-              <w:t>Rule-relevant pairs (R/C/U)</w:t>
-            </w:r>
-          </w:p>
-        </w:tc>
-        <w:tc>
-          <w:tcPr>
-            <w:tcW w:type="dxa" w:w="1960"/>
+                <w:sz w:val="13"/>
+              </w:rPr>
+              <w:t>Naive RAG</w:t>
+            </w:r>
+          </w:p>
+        </w:tc>
+        <w:tc>
+          <w:tcPr>
+            <w:tcW w:type="dxa" w:w="1715"/>
             <w:shd w:val="clear" w:color="auto" w:fill="F2F2F2"/>
             <w:tcBorders>
               <w:bottom w:val="single" w:sz="6" w:space="0" w:color="000000"/>
@@ -10851,7 +10852,31 @@
                 <w:b/>
                 <w:i w:val="0"/>
                 <w:color w:val="000000"/>
-                <w:sz w:val="15"/>
+                <w:sz w:val="13"/>
+              </w:rPr>
+              <w:t>Rule-relevant pairs (R/C/U)</w:t>
+            </w:r>
+          </w:p>
+        </w:tc>
+        <w:tc>
+          <w:tcPr>
+            <w:tcW w:type="dxa" w:w="1715"/>
+            <w:shd w:val="clear" w:color="auto" w:fill="F2F2F2"/>
+            <w:tcBorders>
+              <w:bottom w:val="single" w:sz="6" w:space="0" w:color="000000"/>
+            </w:tcBorders>
+          </w:tcPr>
+          <w:p>
+            <w:pPr>
+              <w:spacing w:after="20" w:before="20" w:line="240" w:lineRule="auto"/>
+            </w:pPr>
+            <w:r>
+              <w:rPr>
+                <w:rFonts w:ascii="Times New Roman" w:hAnsi="Times New Roman" w:eastAsia="宋体"/>
+                <w:b/>
+                <w:i w:val="0"/>
+                <w:color w:val="000000"/>
+                <w:sz w:val="13"/>
               </w:rPr>
               <w:t>Notes</w:t>
             </w:r>
@@ -10864,7 +10889,7 @@
         </w:trPr>
         <w:tc>
           <w:tcPr>
-            <w:tcW w:type="dxa" w:w="1960"/>
+            <w:tcW w:type="dxa" w:w="1715"/>
           </w:tcPr>
           <w:p>
             <w:pPr>
@@ -10876,35 +10901,35 @@
                 <w:b w:val="0"/>
                 <w:i w:val="0"/>
                 <w:color w:val="000000"/>
-                <w:sz w:val="15"/>
-              </w:rPr>
-              <w:t>NHANES, Qwen (internal)</w:t>
-            </w:r>
-          </w:p>
-        </w:tc>
-        <w:tc>
-          <w:tcPr>
-            <w:tcW w:type="dxa" w:w="1960"/>
-          </w:tcPr>
-          <w:p>
-            <w:pPr>
-              <w:spacing w:after="20" w:before="20" w:line="240" w:lineRule="auto"/>
-            </w:pPr>
+                <w:sz w:val="13"/>
+              </w:rPr>
+              <w:t xml:space="preserve">NHANES, Qwen (internal, </w:t>
+            </w:r>
+            <w:r>
+              <w:rPr>
+                <w:rFonts w:ascii="Times New Roman" w:hAnsi="Times New Roman" w:eastAsia="宋体"/>
+                <w:b/>
+                <w:i w:val="0"/>
+                <w:color w:val="000000"/>
+                <w:sz w:val="13"/>
+              </w:rPr>
+              <w:t>in-sample</w:t>
+            </w:r>
             <w:r>
               <w:rPr>
                 <w:rFonts w:ascii="Times New Roman" w:hAnsi="Times New Roman" w:eastAsia="宋体"/>
                 <w:b w:val="0"/>
                 <w:i w:val="0"/>
                 <w:color w:val="000000"/>
-                <w:sz w:val="15"/>
-              </w:rPr>
-              <w:t>0.571 (full agent)</w:t>
-            </w:r>
-          </w:p>
-        </w:tc>
-        <w:tc>
-          <w:tcPr>
-            <w:tcW w:type="dxa" w:w="1960"/>
+                <w:sz w:val="13"/>
+              </w:rPr>
+              <w:t>)</w:t>
+            </w:r>
+          </w:p>
+        </w:tc>
+        <w:tc>
+          <w:tcPr>
+            <w:tcW w:type="dxa" w:w="1715"/>
           </w:tcPr>
           <w:p>
             <w:pPr>
@@ -10916,7 +10941,47 @@
                 <w:b w:val="0"/>
                 <w:i w:val="0"/>
                 <w:color w:val="000000"/>
-                <w:sz w:val="15"/>
+                <w:sz w:val="13"/>
+              </w:rPr>
+              <w:t>0.571</w:t>
+            </w:r>
+          </w:p>
+        </w:tc>
+        <w:tc>
+          <w:tcPr>
+            <w:tcW w:type="dxa" w:w="1715"/>
+          </w:tcPr>
+          <w:p>
+            <w:pPr>
+              <w:spacing w:after="20" w:before="20" w:line="240" w:lineRule="auto"/>
+            </w:pPr>
+            <w:r>
+              <w:rPr>
+                <w:rFonts w:ascii="Times New Roman" w:hAnsi="Times New Roman" w:eastAsia="宋体"/>
+                <w:b w:val="0"/>
+                <w:i w:val="0"/>
+                <w:color w:val="000000"/>
+                <w:sz w:val="13"/>
+              </w:rPr>
+              <w:t>0.522</w:t>
+            </w:r>
+          </w:p>
+        </w:tc>
+        <w:tc>
+          <w:tcPr>
+            <w:tcW w:type="dxa" w:w="1715"/>
+          </w:tcPr>
+          <w:p>
+            <w:pPr>
+              <w:spacing w:after="20" w:before="20" w:line="240" w:lineRule="auto"/>
+            </w:pPr>
+            <w:r>
+              <w:rPr>
+                <w:rFonts w:ascii="Times New Roman" w:hAnsi="Times New Roman" w:eastAsia="宋体"/>
+                <w:b w:val="0"/>
+                <w:i w:val="0"/>
+                <w:color w:val="000000"/>
+                <w:sz w:val="13"/>
               </w:rPr>
               <w:t>0.392</w:t>
             </w:r>
@@ -10924,7 +10989,7 @@
         </w:tc>
         <w:tc>
           <w:tcPr>
-            <w:tcW w:type="dxa" w:w="1960"/>
+            <w:tcW w:type="dxa" w:w="1715"/>
           </w:tcPr>
           <w:p>
             <w:pPr>
@@ -10936,7 +11001,7 @@
                 <w:b w:val="0"/>
                 <w:i w:val="0"/>
                 <w:color w:val="000000"/>
-                <w:sz w:val="15"/>
+                <w:sz w:val="13"/>
               </w:rPr>
               <w:t>0.335</w:t>
             </w:r>
@@ -10944,7 +11009,7 @@
         </w:tc>
         <w:tc>
           <w:tcPr>
-            <w:tcW w:type="dxa" w:w="1960"/>
+            <w:tcW w:type="dxa" w:w="1715"/>
           </w:tcPr>
           <w:p>
             <w:pPr>
@@ -10956,7 +11021,7 @@
                 <w:b w:val="0"/>
                 <w:i w:val="0"/>
                 <w:color w:val="000000"/>
-                <w:sz w:val="15"/>
+                <w:sz w:val="13"/>
               </w:rPr>
               <w:t>0.080</w:t>
             </w:r>
@@ -10964,7 +11029,7 @@
         </w:tc>
         <w:tc>
           <w:tcPr>
-            <w:tcW w:type="dxa" w:w="1960"/>
+            <w:tcW w:type="dxa" w:w="1715"/>
           </w:tcPr>
           <w:p>
             <w:pPr>
@@ -10976,7 +11041,7 @@
                 <w:b w:val="0"/>
                 <w:i w:val="0"/>
                 <w:color w:val="000000"/>
-                <w:sz w:val="15"/>
+                <w:sz w:val="13"/>
               </w:rPr>
               <w:t>16 (6/0/10)</w:t>
             </w:r>
@@ -10984,7 +11049,7 @@
         </w:tc>
         <w:tc>
           <w:tcPr>
-            <w:tcW w:type="dxa" w:w="1960"/>
+            <w:tcW w:type="dxa" w:w="1715"/>
           </w:tcPr>
           <w:p>
             <w:pPr>
@@ -10996,9 +11061,9 @@
                 <w:b w:val="0"/>
                 <w:i w:val="0"/>
                 <w:color w:val="000000"/>
-                <w:sz w:val="15"/>
-              </w:rPr>
-              <w:t>80 pairs; rule-layer ablation 0.522, NC-gated 0.545</w:t>
+                <w:sz w:val="13"/>
+              </w:rPr>
+              <w:t>80 pairs; G1 0.545; recall 1.000 constructed by the v1.2 rule revision</w:t>
             </w:r>
           </w:p>
         </w:tc>
@@ -11009,7 +11074,7 @@
         </w:trPr>
         <w:tc>
           <w:tcPr>
-            <w:tcW w:type="dxa" w:w="1960"/>
+            <w:tcW w:type="dxa" w:w="1715"/>
           </w:tcPr>
           <w:p>
             <w:pPr>
@@ -11021,35 +11086,35 @@
                 <w:b w:val="0"/>
                 <w:i w:val="0"/>
                 <w:color w:val="000000"/>
-                <w:sz w:val="15"/>
-              </w:rPr>
-              <w:t>NHANES, GLM-5.3-flash (internal)</w:t>
-            </w:r>
-          </w:p>
-        </w:tc>
-        <w:tc>
-          <w:tcPr>
-            <w:tcW w:type="dxa" w:w="1960"/>
-          </w:tcPr>
-          <w:p>
-            <w:pPr>
-              <w:spacing w:after="20" w:before="20" w:line="240" w:lineRule="auto"/>
-            </w:pPr>
+                <w:sz w:val="13"/>
+              </w:rPr>
+              <w:t xml:space="preserve">NHANES, GLM-5.3-flash (internal, </w:t>
+            </w:r>
+            <w:r>
+              <w:rPr>
+                <w:rFonts w:ascii="Times New Roman" w:hAnsi="Times New Roman" w:eastAsia="宋体"/>
+                <w:b/>
+                <w:i w:val="0"/>
+                <w:color w:val="000000"/>
+                <w:sz w:val="13"/>
+              </w:rPr>
+              <w:t>in-sample</w:t>
+            </w:r>
             <w:r>
               <w:rPr>
                 <w:rFonts w:ascii="Times New Roman" w:hAnsi="Times New Roman" w:eastAsia="宋体"/>
                 <w:b w:val="0"/>
                 <w:i w:val="0"/>
                 <w:color w:val="000000"/>
-                <w:sz w:val="15"/>
-              </w:rPr>
-              <w:t>0.522 (full agent)</w:t>
-            </w:r>
-          </w:p>
-        </w:tc>
-        <w:tc>
-          <w:tcPr>
-            <w:tcW w:type="dxa" w:w="1960"/>
+                <w:sz w:val="13"/>
+              </w:rPr>
+              <w:t>)</w:t>
+            </w:r>
+          </w:p>
+        </w:tc>
+        <w:tc>
+          <w:tcPr>
+            <w:tcW w:type="dxa" w:w="1715"/>
           </w:tcPr>
           <w:p>
             <w:pPr>
@@ -11061,7 +11126,47 @@
                 <w:b w:val="0"/>
                 <w:i w:val="0"/>
                 <w:color w:val="000000"/>
-                <w:sz w:val="15"/>
+                <w:sz w:val="13"/>
+              </w:rPr>
+              <w:t>0.522</w:t>
+            </w:r>
+          </w:p>
+        </w:tc>
+        <w:tc>
+          <w:tcPr>
+            <w:tcW w:type="dxa" w:w="1715"/>
+          </w:tcPr>
+          <w:p>
+            <w:pPr>
+              <w:spacing w:after="20" w:before="20" w:line="240" w:lineRule="auto"/>
+            </w:pPr>
+            <w:r>
+              <w:rPr>
+                <w:rFonts w:ascii="Times New Roman" w:hAnsi="Times New Roman" w:eastAsia="宋体"/>
+                <w:b w:val="0"/>
+                <w:i w:val="0"/>
+                <w:color w:val="000000"/>
+                <w:sz w:val="13"/>
+              </w:rPr>
+              <w:t>0.480</w:t>
+            </w:r>
+          </w:p>
+        </w:tc>
+        <w:tc>
+          <w:tcPr>
+            <w:tcW w:type="dxa" w:w="1715"/>
+          </w:tcPr>
+          <w:p>
+            <w:pPr>
+              <w:spacing w:after="20" w:before="20" w:line="240" w:lineRule="auto"/>
+            </w:pPr>
+            <w:r>
+              <w:rPr>
+                <w:rFonts w:ascii="Times New Roman" w:hAnsi="Times New Roman" w:eastAsia="宋体"/>
+                <w:b w:val="0"/>
+                <w:i w:val="0"/>
+                <w:color w:val="000000"/>
+                <w:sz w:val="13"/>
               </w:rPr>
               <w:t>0.186</w:t>
             </w:r>
@@ -11069,7 +11174,7 @@
         </w:tc>
         <w:tc>
           <w:tcPr>
-            <w:tcW w:type="dxa" w:w="1960"/>
+            <w:tcW w:type="dxa" w:w="1715"/>
           </w:tcPr>
           <w:p>
             <w:pPr>
@@ -11081,7 +11186,7 @@
                 <w:b w:val="0"/>
                 <w:i w:val="0"/>
                 <w:color w:val="000000"/>
-                <w:sz w:val="15"/>
+                <w:sz w:val="13"/>
               </w:rPr>
               <w:t>0.178</w:t>
             </w:r>
@@ -11089,7 +11194,7 @@
         </w:tc>
         <w:tc>
           <w:tcPr>
-            <w:tcW w:type="dxa" w:w="1960"/>
+            <w:tcW w:type="dxa" w:w="1715"/>
           </w:tcPr>
           <w:p>
             <w:pPr>
@@ -11101,7 +11206,7 @@
                 <w:b w:val="0"/>
                 <w:i w:val="0"/>
                 <w:color w:val="000000"/>
-                <w:sz w:val="15"/>
+                <w:sz w:val="13"/>
               </w:rPr>
               <w:t>0.069</w:t>
             </w:r>
@@ -11109,7 +11214,7 @@
         </w:tc>
         <w:tc>
           <w:tcPr>
-            <w:tcW w:type="dxa" w:w="1960"/>
+            <w:tcW w:type="dxa" w:w="1715"/>
           </w:tcPr>
           <w:p>
             <w:pPr>
@@ -11121,7 +11226,7 @@
                 <w:b w:val="0"/>
                 <w:i w:val="0"/>
                 <w:color w:val="000000"/>
-                <w:sz w:val="15"/>
+                <w:sz w:val="13"/>
               </w:rPr>
               <w:t>16 (6/0/10)</w:t>
             </w:r>
@@ -11129,7 +11234,7 @@
         </w:tc>
         <w:tc>
           <w:tcPr>
-            <w:tcW w:type="dxa" w:w="1960"/>
+            <w:tcW w:type="dxa" w:w="1715"/>
           </w:tcPr>
           <w:p>
             <w:pPr>
@@ -11141,9 +11246,9 @@
                 <w:b w:val="0"/>
                 <w:i w:val="0"/>
                 <w:color w:val="000000"/>
-                <w:sz w:val="15"/>
-              </w:rPr>
-              <w:t>159 pairs; rule-layer ablation 0.480</w:t>
+                <w:sz w:val="13"/>
+              </w:rPr>
+              <w:t>159 pairs; same in-sample caveat</w:t>
             </w:r>
           </w:p>
         </w:tc>
@@ -11154,7 +11259,7 @@
         </w:trPr>
         <w:tc>
           <w:tcPr>
-            <w:tcW w:type="dxa" w:w="1960"/>
+            <w:tcW w:type="dxa" w:w="1715"/>
           </w:tcPr>
           <w:p>
             <w:pPr>
@@ -11166,7 +11271,7 @@
                 <w:b w:val="0"/>
                 <w:i w:val="0"/>
                 <w:color w:val="000000"/>
-                <w:sz w:val="15"/>
+                <w:sz w:val="13"/>
               </w:rPr>
               <w:t>KNHANES (external, site)</w:t>
             </w:r>
@@ -11174,7 +11279,27 @@
         </w:tc>
         <w:tc>
           <w:tcPr>
-            <w:tcW w:type="dxa" w:w="1960"/>
+            <w:tcW w:type="dxa" w:w="1715"/>
+          </w:tcPr>
+          <w:p>
+            <w:pPr>
+              <w:spacing w:after="20" w:before="20" w:line="240" w:lineRule="auto"/>
+            </w:pPr>
+            <w:r>
+              <w:rPr>
+                <w:rFonts w:ascii="Times New Roman" w:hAnsi="Times New Roman" w:eastAsia="宋体"/>
+                <w:b/>
+                <w:i w:val="0"/>
+                <w:color w:val="000000"/>
+                <w:sz w:val="13"/>
+              </w:rPr>
+              <w:t>0.312</w:t>
+            </w:r>
+          </w:p>
+        </w:tc>
+        <w:tc>
+          <w:tcPr>
+            <w:tcW w:type="dxa" w:w="1715"/>
           </w:tcPr>
           <w:p>
             <w:pPr>
@@ -11186,7 +11311,7 @@
                 <w:b w:val="0"/>
                 <w:i w:val="0"/>
                 <w:color w:val="000000"/>
-                <w:sz w:val="15"/>
+                <w:sz w:val="13"/>
               </w:rPr>
               <w:t>0.360</w:t>
             </w:r>
@@ -11194,7 +11319,7 @@
         </w:tc>
         <w:tc>
           <w:tcPr>
-            <w:tcW w:type="dxa" w:w="1960"/>
+            <w:tcW w:type="dxa" w:w="1715"/>
           </w:tcPr>
           <w:p>
             <w:pPr>
@@ -11206,7 +11331,7 @@
                 <w:b w:val="0"/>
                 <w:i w:val="0"/>
                 <w:color w:val="000000"/>
-                <w:sz w:val="15"/>
+                <w:sz w:val="13"/>
               </w:rPr>
               <w:t>0.145</w:t>
             </w:r>
@@ -11214,7 +11339,7 @@
         </w:tc>
         <w:tc>
           <w:tcPr>
-            <w:tcW w:type="dxa" w:w="1960"/>
+            <w:tcW w:type="dxa" w:w="1715"/>
           </w:tcPr>
           <w:p>
             <w:pPr>
@@ -11226,7 +11351,7 @@
                 <w:b w:val="0"/>
                 <w:i w:val="0"/>
                 <w:color w:val="000000"/>
-                <w:sz w:val="15"/>
+                <w:sz w:val="13"/>
               </w:rPr>
               <w:t>0.135</w:t>
             </w:r>
@@ -11234,7 +11359,7 @@
         </w:tc>
         <w:tc>
           <w:tcPr>
-            <w:tcW w:type="dxa" w:w="1960"/>
+            <w:tcW w:type="dxa" w:w="1715"/>
           </w:tcPr>
           <w:p>
             <w:pPr>
@@ -11246,7 +11371,7 @@
                 <w:b w:val="0"/>
                 <w:i w:val="0"/>
                 <w:color w:val="000000"/>
-                <w:sz w:val="15"/>
+                <w:sz w:val="13"/>
               </w:rPr>
               <w:t>0.094</w:t>
             </w:r>
@@ -11254,7 +11379,7 @@
         </w:tc>
         <w:tc>
           <w:tcPr>
-            <w:tcW w:type="dxa" w:w="1960"/>
+            <w:tcW w:type="dxa" w:w="1715"/>
           </w:tcPr>
           <w:p>
             <w:pPr>
@@ -11266,7 +11391,7 @@
                 <w:b w:val="0"/>
                 <w:i w:val="0"/>
                 <w:color w:val="000000"/>
-                <w:sz w:val="15"/>
+                <w:sz w:val="13"/>
               </w:rPr>
               <w:t>15 (5/0/10)</w:t>
             </w:r>
@@ -11274,7 +11399,7 @@
         </w:tc>
         <w:tc>
           <w:tcPr>
-            <w:tcW w:type="dxa" w:w="1960"/>
+            <w:tcW w:type="dxa" w:w="1715"/>
           </w:tcPr>
           <w:p>
             <w:pPr>
@@ -11286,9 +11411,9 @@
                 <w:b w:val="0"/>
                 <w:i w:val="0"/>
                 <w:color w:val="000000"/>
-                <w:sz w:val="15"/>
-              </w:rPr>
-              <w:t>301 pairs</w:t>
+                <w:sz w:val="13"/>
+              </w:rPr>
+              <w:t>301 pairs; agent ran end to end; gates raise precision 0.281→0.357 and halve recall 0.500→0.278</w:t>
             </w:r>
           </w:p>
         </w:tc>
@@ -11299,7 +11424,7 @@
         </w:trPr>
         <w:tc>
           <w:tcPr>
-            <w:tcW w:type="dxa" w:w="1960"/>
+            <w:tcW w:type="dxa" w:w="1715"/>
           </w:tcPr>
           <w:p>
             <w:pPr>
@@ -11311,7 +11436,7 @@
                 <w:b w:val="0"/>
                 <w:i w:val="0"/>
                 <w:color w:val="000000"/>
-                <w:sz w:val="15"/>
+                <w:sz w:val="13"/>
               </w:rPr>
               <w:t>CHARLS (external, site)</w:t>
             </w:r>
@@ -11319,7 +11444,7 @@
         </w:tc>
         <w:tc>
           <w:tcPr>
-            <w:tcW w:type="dxa" w:w="1960"/>
+            <w:tcW w:type="dxa" w:w="1715"/>
           </w:tcPr>
           <w:p>
             <w:pPr>
@@ -11331,7 +11456,7 @@
                 <w:b w:val="0"/>
                 <w:i w:val="0"/>
                 <w:color w:val="000000"/>
-                <w:sz w:val="15"/>
+                <w:sz w:val="13"/>
               </w:rPr>
               <w:t>not assessed</w:t>
             </w:r>
@@ -11339,7 +11464,7 @@
         </w:tc>
         <w:tc>
           <w:tcPr>
-            <w:tcW w:type="dxa" w:w="1960"/>
+            <w:tcW w:type="dxa" w:w="1715"/>
           </w:tcPr>
           <w:p>
             <w:pPr>
@@ -11351,7 +11476,7 @@
                 <w:b w:val="0"/>
                 <w:i w:val="0"/>
                 <w:color w:val="000000"/>
-                <w:sz w:val="15"/>
+                <w:sz w:val="13"/>
               </w:rPr>
               <w:t>not assessed</w:t>
             </w:r>
@@ -11359,7 +11484,7 @@
         </w:tc>
         <w:tc>
           <w:tcPr>
-            <w:tcW w:type="dxa" w:w="1960"/>
+            <w:tcW w:type="dxa" w:w="1715"/>
           </w:tcPr>
           <w:p>
             <w:pPr>
@@ -11371,7 +11496,7 @@
                 <w:b w:val="0"/>
                 <w:i w:val="0"/>
                 <w:color w:val="000000"/>
-                <w:sz w:val="15"/>
+                <w:sz w:val="13"/>
               </w:rPr>
               <w:t>not assessed</w:t>
             </w:r>
@@ -11379,7 +11504,7 @@
         </w:tc>
         <w:tc>
           <w:tcPr>
-            <w:tcW w:type="dxa" w:w="1960"/>
+            <w:tcW w:type="dxa" w:w="1715"/>
           </w:tcPr>
           <w:p>
             <w:pPr>
@@ -11391,7 +11516,7 @@
                 <w:b w:val="0"/>
                 <w:i w:val="0"/>
                 <w:color w:val="000000"/>
-                <w:sz w:val="15"/>
+                <w:sz w:val="13"/>
               </w:rPr>
               <w:t>not assessed</w:t>
             </w:r>
@@ -11399,7 +11524,7 @@
         </w:tc>
         <w:tc>
           <w:tcPr>
-            <w:tcW w:type="dxa" w:w="1960"/>
+            <w:tcW w:type="dxa" w:w="1715"/>
           </w:tcPr>
           <w:p>
             <w:pPr>
@@ -11411,7 +11536,27 @@
                 <w:b w:val="0"/>
                 <w:i w:val="0"/>
                 <w:color w:val="000000"/>
-                <w:sz w:val="15"/>
+                <w:sz w:val="13"/>
+              </w:rPr>
+              <w:t>not assessed</w:t>
+            </w:r>
+          </w:p>
+        </w:tc>
+        <w:tc>
+          <w:tcPr>
+            <w:tcW w:type="dxa" w:w="1715"/>
+          </w:tcPr>
+          <w:p>
+            <w:pPr>
+              <w:spacing w:after="20" w:before="20" w:line="240" w:lineRule="auto"/>
+            </w:pPr>
+            <w:r>
+              <w:rPr>
+                <w:rFonts w:ascii="Times New Roman" w:hAnsi="Times New Roman" w:eastAsia="宋体"/>
+                <w:b w:val="0"/>
+                <w:i w:val="0"/>
+                <w:color w:val="000000"/>
+                <w:sz w:val="13"/>
               </w:rPr>
               <w:t>4 (0/0/4)</w:t>
             </w:r>
@@ -11419,7 +11564,7 @@
         </w:tc>
         <w:tc>
           <w:tcPr>
-            <w:tcW w:type="dxa" w:w="1960"/>
+            <w:tcW w:type="dxa" w:w="1715"/>
           </w:tcPr>
           <w:p>
             <w:pPr>
@@ -11431,9 +11576,9 @@
                 <w:b w:val="0"/>
                 <w:i w:val="0"/>
                 <w:color w:val="000000"/>
-                <w:sz w:val="15"/>
-              </w:rPr>
-              <w:t>14 pairs; direction check only</w:t>
+                <w:sz w:val="13"/>
+              </w:rPr>
+              <w:t>14 pairs; rule-level direction only</w:t>
             </w:r>
           </w:p>
         </w:tc>
@@ -11444,7 +11589,7 @@
         </w:trPr>
         <w:tc>
           <w:tcPr>
-            <w:tcW w:type="dxa" w:w="1960"/>
+            <w:tcW w:type="dxa" w:w="1715"/>
           </w:tcPr>
           <w:p>
             <w:pPr>
@@ -11456,7 +11601,7 @@
                 <w:b w:val="0"/>
                 <w:i w:val="0"/>
                 <w:color w:val="000000"/>
-                <w:sz w:val="15"/>
+                <w:sz w:val="13"/>
               </w:rPr>
               <w:t>Eight ageing cohorts (external, population)</w:t>
             </w:r>
@@ -11464,7 +11609,7 @@
         </w:tc>
         <w:tc>
           <w:tcPr>
-            <w:tcW w:type="dxa" w:w="1960"/>
+            <w:tcW w:type="dxa" w:w="1715"/>
           </w:tcPr>
           <w:p>
             <w:pPr>
@@ -11476,7 +11621,7 @@
                 <w:b w:val="0"/>
                 <w:i w:val="0"/>
                 <w:color w:val="000000"/>
-                <w:sz w:val="15"/>
+                <w:sz w:val="13"/>
               </w:rPr>
               <w:t>not assessed</w:t>
             </w:r>
@@ -11484,7 +11629,7 @@
         </w:tc>
         <w:tc>
           <w:tcPr>
-            <w:tcW w:type="dxa" w:w="1960"/>
+            <w:tcW w:type="dxa" w:w="1715"/>
           </w:tcPr>
           <w:p>
             <w:pPr>
@@ -11496,7 +11641,7 @@
                 <w:b w:val="0"/>
                 <w:i w:val="0"/>
                 <w:color w:val="000000"/>
-                <w:sz w:val="15"/>
+                <w:sz w:val="13"/>
               </w:rPr>
               <w:t>not assessed</w:t>
             </w:r>
@@ -11504,7 +11649,7 @@
         </w:tc>
         <w:tc>
           <w:tcPr>
-            <w:tcW w:type="dxa" w:w="1960"/>
+            <w:tcW w:type="dxa" w:w="1715"/>
           </w:tcPr>
           <w:p>
             <w:pPr>
@@ -11516,7 +11661,7 @@
                 <w:b w:val="0"/>
                 <w:i w:val="0"/>
                 <w:color w:val="000000"/>
-                <w:sz w:val="15"/>
+                <w:sz w:val="13"/>
               </w:rPr>
               <w:t>not assessed</w:t>
             </w:r>
@@ -11524,7 +11669,7 @@
         </w:tc>
         <w:tc>
           <w:tcPr>
-            <w:tcW w:type="dxa" w:w="1960"/>
+            <w:tcW w:type="dxa" w:w="1715"/>
           </w:tcPr>
           <w:p>
             <w:pPr>
@@ -11536,7 +11681,7 @@
                 <w:b w:val="0"/>
                 <w:i w:val="0"/>
                 <w:color w:val="000000"/>
-                <w:sz w:val="15"/>
+                <w:sz w:val="13"/>
               </w:rPr>
               <w:t>not assessed</w:t>
             </w:r>
@@ -11544,7 +11689,7 @@
         </w:tc>
         <w:tc>
           <w:tcPr>
-            <w:tcW w:type="dxa" w:w="1960"/>
+            <w:tcW w:type="dxa" w:w="1715"/>
           </w:tcPr>
           <w:p>
             <w:pPr>
@@ -11556,7 +11701,27 @@
                 <w:b w:val="0"/>
                 <w:i w:val="0"/>
                 <w:color w:val="000000"/>
-                <w:sz w:val="15"/>
+                <w:sz w:val="13"/>
+              </w:rPr>
+              <w:t>not assessed</w:t>
+            </w:r>
+          </w:p>
+        </w:tc>
+        <w:tc>
+          <w:tcPr>
+            <w:tcW w:type="dxa" w:w="1715"/>
+          </w:tcPr>
+          <w:p>
+            <w:pPr>
+              <w:spacing w:after="20" w:before="20" w:line="240" w:lineRule="auto"/>
+            </w:pPr>
+            <w:r>
+              <w:rPr>
+                <w:rFonts w:ascii="Times New Roman" w:hAnsi="Times New Roman" w:eastAsia="宋体"/>
+                <w:b w:val="0"/>
+                <w:i w:val="0"/>
+                <w:color w:val="000000"/>
+                <w:sz w:val="13"/>
               </w:rPr>
               <w:t>18 (8/2/8)</w:t>
             </w:r>
@@ -11564,7 +11729,7 @@
         </w:tc>
         <w:tc>
           <w:tcPr>
-            <w:tcW w:type="dxa" w:w="1960"/>
+            <w:tcW w:type="dxa" w:w="1715"/>
           </w:tcPr>
           <w:p>
             <w:pPr>
@@ -11576,7 +11741,7 @@
                 <w:b w:val="0"/>
                 <w:i w:val="0"/>
                 <w:color w:val="000000"/>
-                <w:sz w:val="15"/>
+                <w:sz w:val="13"/>
               </w:rPr>
               <w:t>6 of 21 rules testable; 18 of 168 cells feasible</w:t>
             </w:r>
@@ -11589,7 +11754,7 @@
         </w:trPr>
         <w:tc>
           <w:tcPr>
-            <w:tcW w:type="dxa" w:w="1960"/>
+            <w:tcW w:type="dxa" w:w="1715"/>
           </w:tcPr>
           <w:p>
             <w:pPr>
@@ -11601,7 +11766,7 @@
                 <w:b w:val="0"/>
                 <w:i w:val="0"/>
                 <w:color w:val="000000"/>
-                <w:sz w:val="15"/>
+                <w:sz w:val="13"/>
               </w:rPr>
               <w:t>Literature indexes (independent)</w:t>
             </w:r>
@@ -11609,7 +11774,7 @@
         </w:tc>
         <w:tc>
           <w:tcPr>
-            <w:tcW w:type="dxa" w:w="1960"/>
+            <w:tcW w:type="dxa" w:w="1715"/>
           </w:tcPr>
           <w:p>
             <w:pPr>
@@ -11621,7 +11786,7 @@
                 <w:b w:val="0"/>
                 <w:i w:val="0"/>
                 <w:color w:val="000000"/>
-                <w:sz w:val="15"/>
+                <w:sz w:val="13"/>
               </w:rPr>
               <w:t>not applicable</w:t>
             </w:r>
@@ -11629,7 +11794,7 @@
         </w:tc>
         <w:tc>
           <w:tcPr>
-            <w:tcW w:type="dxa" w:w="1960"/>
+            <w:tcW w:type="dxa" w:w="1715"/>
           </w:tcPr>
           <w:p>
             <w:pPr>
@@ -11641,7 +11806,7 @@
                 <w:b w:val="0"/>
                 <w:i w:val="0"/>
                 <w:color w:val="000000"/>
-                <w:sz w:val="15"/>
+                <w:sz w:val="13"/>
               </w:rPr>
               <w:t>not applicable</w:t>
             </w:r>
@@ -11649,7 +11814,7 @@
         </w:tc>
         <w:tc>
           <w:tcPr>
-            <w:tcW w:type="dxa" w:w="1960"/>
+            <w:tcW w:type="dxa" w:w="1715"/>
           </w:tcPr>
           <w:p>
             <w:pPr>
@@ -11661,7 +11826,7 @@
                 <w:b w:val="0"/>
                 <w:i w:val="0"/>
                 <w:color w:val="000000"/>
-                <w:sz w:val="15"/>
+                <w:sz w:val="13"/>
               </w:rPr>
               <w:t>not applicable</w:t>
             </w:r>
@@ -11669,7 +11834,7 @@
         </w:tc>
         <w:tc>
           <w:tcPr>
-            <w:tcW w:type="dxa" w:w="1960"/>
+            <w:tcW w:type="dxa" w:w="1715"/>
           </w:tcPr>
           <w:p>
             <w:pPr>
@@ -11681,7 +11846,7 @@
                 <w:b w:val="0"/>
                 <w:i w:val="0"/>
                 <w:color w:val="000000"/>
-                <w:sz w:val="15"/>
+                <w:sz w:val="13"/>
               </w:rPr>
               <w:t>not applicable</w:t>
             </w:r>
@@ -11689,7 +11854,7 @@
         </w:tc>
         <w:tc>
           <w:tcPr>
-            <w:tcW w:type="dxa" w:w="1960"/>
+            <w:tcW w:type="dxa" w:w="1715"/>
           </w:tcPr>
           <w:p>
             <w:pPr>
@@ -11701,7 +11866,27 @@
                 <w:b w:val="0"/>
                 <w:i w:val="0"/>
                 <w:color w:val="000000"/>
-                <w:sz w:val="15"/>
+                <w:sz w:val="13"/>
+              </w:rPr>
+              <w:t>not applicable</w:t>
+            </w:r>
+          </w:p>
+        </w:tc>
+        <w:tc>
+          <w:tcPr>
+            <w:tcW w:type="dxa" w:w="1715"/>
+          </w:tcPr>
+          <w:p>
+            <w:pPr>
+              <w:spacing w:after="20" w:before="20" w:line="240" w:lineRule="auto"/>
+            </w:pPr>
+            <w:r>
+              <w:rPr>
+                <w:rFonts w:ascii="Times New Roman" w:hAnsi="Times New Roman" w:eastAsia="宋体"/>
+                <w:b w:val="0"/>
+                <w:i w:val="0"/>
+                <w:color w:val="000000"/>
+                <w:sz w:val="13"/>
               </w:rPr>
               <w:t>—</w:t>
             </w:r>
@@ -11709,7 +11894,7 @@
         </w:tc>
         <w:tc>
           <w:tcPr>
-            <w:tcW w:type="dxa" w:w="1960"/>
+            <w:tcW w:type="dxa" w:w="1715"/>
           </w:tcPr>
           <w:p>
             <w:pPr>
@@ -11721,7 +11906,7 @@
                 <w:b w:val="0"/>
                 <w:i w:val="0"/>
                 <w:color w:val="000000"/>
-                <w:sz w:val="15"/>
+                <w:sz w:val="13"/>
               </w:rPr>
               <w:t>0.800–0.922 (4 indexes)</w:t>
             </w:r>
@@ -11752,7 +11937,7 @@
           <w:color w:val="000000"/>
           <w:sz w:val="16"/>
         </w:rPr>
-        <w:t xml:space="preserve"> System-level F1 was measured only where the three baselines were run (NHANES, two generations; KNHANES). CHARLS and the eight cohorts were evaluated at the rule level, so “not assessed” indicates a different validation target, not a missing result. R/C/U order is replicated/contradicted/uninformative rule-relevant pairs. Full-agent F1 is the deployable G2 configuration on the primary matrix; KNHANES reports the rule layer; on GLM-5.3-flash the full agent scored 0.522 versus rule layer 0.480. The arbiter affects the report and risk grade. The literature layer reports index-level precision, not F1: PubMed 0.889, Web of Science 0.916, Europe PMC 0.922 and CNKI 0.800.</w:t>
+        <w:t xml:space="preserve"> System-level F1 was measured wherever the three baselines were run, which is NHANES (two generations) and KNHANES. The NHANES matrix is labeled in-sample because the rule set was revised after the first confirmatory run; its recall of 1.000 is a property of that revision (the pre-revision v1.1 set scored 0.111 on the same scope under the earlier gold), so its F1 is not an out-of-sample estimate. KNHANES is the only external matrix on which the full agent ran end to end; there the agent beats all three baselines but not its own deterministic rule layer. CHARLS and the eight cohorts were evaluated at the rule level, so "not assessed" indicates a different validation target, not a missing result. R/C/U order is replicated/contradicted/uninformative rule-relevant pairs. The literature layer reports index-level precision, not F1: PubMed 0.889, Web of Science 0.916, Europe PMC 0.922 and CNKI 0.800.</w:t>
       </w:r>
     </w:p>
     <w:p>

</xml_diff>

<commit_message>
R31 addendum: arbiter backend swap qwen->glm-5.3-flash leaves all 474 predictions byte-identical (arbiter decides 3 cells); record evidence, note in Discussion
</commit_message>
<xml_diff>
--- a/outputs/paper/manuscript_agent_first.docx
+++ b/outputs/paper/manuscript_agent_first.docx
@@ -188,7 +188,7 @@
           <w:color w:val="000000"/>
           <w:sz w:val="21"/>
         </w:rPr>
-        <w:t>Main text: 6,276 words (Introduction–Discussion); abstract 334 words</w:t>
+        <w:t>Main text: 6,328 words (Introduction–Discussion); abstract 334 words</w:t>
         <w:br/>
       </w:r>
       <w:r>
@@ -2056,7 +2056,7 @@
           <w:color w:val="000000"/>
           <w:sz w:val="24"/>
         </w:rPr>
-        <w:t>The gain over LLM baselines is architectural, not scale. On the NHANES matrices the deployable full agent scored 0.571 (80 pairs) and 0.522 (159 pairs, versus rule layer 0.480); the ablation localises the gain: rule layer 0.522, +negative-control gate 0.545, +evidence confirmation and arbiter 0.571. A stronger commercial model as a standalone judge produced more, not fewer, false positives. That ordering does not carry over to independent data. On KNHANES the same gates raised precision from 0.281 to 0.357 while cutting recall from 0.500 to 0.278, leaving the agent below the bare rule layer (0.312 versus 0.360): the evidence store rarely holds a B-or-better chunk for pairs that a new country's data replicates, so the confirmation step abstains exactly where the rule layer was right. Every output still resolves to a rule, a KG path and a source chunk; that demonstrates operability, not clinical usability or deployment.</w:t>
+        <w:t>The gain over LLM baselines is architectural, not scale. On the NHANES matrices the deployable full agent scored 0.571 (80 pairs) and 0.522 (159 pairs, versus rule layer 0.480); the ablation localises the gain: rule layer 0.522, +negative-control gate 0.545, +evidence confirmation and arbiter 0.571. A stronger commercial model as a standalone judge produced more, not fewer, false positives, and swapping the arbiter itself for GLM-5.3-flash left every one of the 474 predictions unchanged: the arbiter decides 3 cells, the remaining 471 being settled by the rule layer, the negative-control gate or the evidence-B+ gate. The measured gain therefore belongs to the rule and gate layers, not to the language model. That ordering does not carry over to independent data. On KNHANES the same gates raised precision from 0.281 to 0.357 while cutting recall from 0.500 to 0.278, leaving the agent below the bare rule layer (0.312 versus 0.360): the evidence store rarely holds a B-or-better chunk for pairs that a new country's data replicates, so the confirmation step abstains exactly where the rule layer was right. Every output still resolves to a rule, a KG path and a source chunk; that demonstrates operability, not clinical usability or deployment.</w:t>
       </w:r>
     </w:p>
     <w:p>

</xml_diff>

<commit_message>
R31 correction: three implementation defects (baseline parse handling, harness rule matching, outcome-variant retrieval) fixed under pre-registered P0/P0b/P0c; external G2 0.375 vs rule 0.360 and 0.211 vs 0.200 on revision-free pairs; internal matrix has zero contamination-free positives; manuscript rebuilt
</commit_message>
<xml_diff>
--- a/outputs/paper/manuscript_agent_first.docx
+++ b/outputs/paper/manuscript_agent_first.docx
@@ -188,7 +188,7 @@
           <w:color w:val="000000"/>
           <w:sz w:val="21"/>
         </w:rPr>
-        <w:t>Main text: 6,328 words (Introduction–Discussion); abstract 334 words</w:t>
+        <w:t>Main text: 6,495 words (Introduction–Discussion); abstract 371 words</w:t>
         <w:br/>
       </w:r>
       <w:r>
@@ -327,7 +327,7 @@
           <w:color w:val="000000"/>
           <w:sz w:val="24"/>
         </w:rPr>
-        <w:t xml:space="preserve"> Huiyan combines 21 rules, a LightRAG knowledge graph of 1,060 evidence chunks and an LLM arbiter that returns a source-linked trace. We evaluated system-level classification of the deployable agent against three baselines (internal NHANES, which also informed rule development; external KNHANES), rule-level direction under a pre-registered three-state standard (CHARLS; eight ageing cohorts, 285,878 participants), and concordance across four literature indexes.</w:t>
+        <w:t xml:space="preserve"> Huiyan combines 21 rules, a LightRAG knowledge graph of 1,060 evidence chunks and an LLM arbiter that returns a source-linked trace. We evaluated system-level classification against three baselines (internal NHANES, which also informed rule development; external KNHANES), rule-level direction under a pre-registered three-state standard (CHARLS; eight ageing cohorts, 285,878 participants), and concordance across four literature indexes. We additionally audited which evaluation pairs the post-confirmatory rule revision had touched and repeated the external comparison on the untouched subset.</w:t>
       </w:r>
     </w:p>
     <w:p>
@@ -354,7 +354,7 @@
           <w:color w:val="000000"/>
           <w:sz w:val="24"/>
         </w:rPr>
-        <w:t xml:space="preserve"> System track: internally the agent reached F1 0.571 (80 pairs; LightRAG 0.392, pure LLM 0.335, naive RAG 0.080) and 0.522 (159 pairs; 0.186, 0.178, 0.069). That matrix is in-sample: the rule set was revised after the first confirmatory run, so recall of 1.000 is a property of that revision (the pre-revision set scored 0.111). Externally (KNHANES, 301 pairs) the same agent scored 0.312 against 0.145, 0.135 and 0.094, but below its deterministic rule layer (0.360): the gates raised precision (0.281 to 0.357) and halved recall (0.500 to 0.278). Under a binary collapse, sensitivity was 1.00 internally and 0.278 externally, with external specificity 0.968 and kappa 0.275. Rule track: only 6 of 21 rules were testable in the cohorts; of 18 rule x cohort pairs, 8 replicated, 8 were uninformative and 2 contradicted; two met the pre-registered criterion but both intervals spanned unity. Literature concordance was 0.889 (PubMed), 0.916 (Web of Science), 0.922 (Europe PMC) and 0.800 (CNKI), with 16/17 cross-index agreement.</w:t>
+        <w:t xml:space="preserve"> The internal matrix contained no replicated pair that the rule revision had not touched (0 of 6), so it yields no out-of-sample estimate and is reported only as a development description (agent F1 0.571 versus rule layer 0.522). Externally, on 301 KNHANES pairs the agent scored 0.375 against 0.360 for its own deterministic rule layer and 0.176, 0.173 and 0.120 for LightRAG, a pure LLM and naive RAG. On the 296 pairs untouched by the revision the ordering held but the level collapsed: 0.211, 0.200, 0.122, 0.089 and 0.086. The agent's advantage is precision, not recall: it flags 30 of 301 pairs, 9 of them correctly, and its recall on replicated pairs is 0.500 with a 16.7% flag rate on contradicted and 7.2% on uninformative pairs. Rule track: only 6 of 21 rules were testable in the cohorts; of 18 rule x cohort pairs, 8 replicated, 8 were uninformative and 2 contradicted; two met the pre-registered criterion, but both prediction intervals spanned unity. Literature concordance was 0.889 (PubMed), 0.916 (Web of Science), 0.922 (Europe PMC) and 0.800 (CNKI), with 16/17 cross-index agreement.</w:t>
       </w:r>
     </w:p>
     <w:p>
@@ -381,7 +381,7 @@
           <w:color w:val="000000"/>
           <w:sz w:val="24"/>
         </w:rPr>
-        <w:t xml:space="preserve"> The agent outperformed LLM and RAG baselines on two national surveys and returned a source-linked report through a working interface, yet on independent data it did not outperform its own deterministic rule layer. Its rules were largely untestable elsewhere (15 of 21), and none was robustly transportable where testable; the constraint was measurement, not sample size. Agent validation should report system-level and rule-level results separately, state whether the benchmark informed development, and state which exposures were measured.</w:t>
+        <w:t xml:space="preserve"> The agent outperformed LLM and RAG baselines, and narrowly its own rule layer, on external data, but only a fifth of its external F1 survives when the pairs that informed development are removed. Its rules were largely untestable elsewhere (15 of 21), and none was robustly transportable where testable; the constraint was measurement, not sample size. Agent validation should report system-level and rule-level results separately, disclose which pairs informed development, and state which exposures were measured.</w:t>
       </w:r>
     </w:p>
     <w:p>
@@ -1044,7 +1044,7 @@
           <w:color w:val="000000"/>
           <w:sz w:val="24"/>
         </w:rPr>
-        <w:t>Survey design variance was specified but not implemented: the cohort frames contain no weight, strata or PSU variable (SHARE's country field is empty in all 1,693,515 rows), so every confidence interval, q-value and three-state label rests on unweighted cluster-robust variance. The rule set was modified after the first confirmatory run: the 20-rule v1.1 set became the 21-rule v1.2 set (exposure cross-coverage of r02/r03/r04 altered; r22 added) and the confirmatory analysis was re-run. The pre-registration records this as test-set fitting and states that the resulting recall of 1.000 is constructed rather than earned; internal-layer precision is reported for completeness and is not load-bearing for the cohort-layer conclusions. No pre-run version-control snapshot exists; the timeline is documented in Supplementary Methods.</w:t>
+        <w:t>Survey design variance was specified but not implemented: the cohort frames contain no weight, strata or PSU variable (SHARE's country field is empty in all 1,693,515 rows), so every confidence interval, q-value and three-state label rests on unweighted cluster-robust variance. The rule set was modified after the first confirmatory run: the 20-rule v1.1 set became the 21-rule v1.2 set (exposure cross-coverage of r02/r03/r04 altered; r22 added) and the confirmatory analysis was re-run. The pre-registration records this as test-set fitting; the resulting recall of 1.000 is constructed, not earned. No pre-run version-control snapshot exists; the timeline is documented in Supplementary Methods.</w:t>
       </w:r>
     </w:p>
     <w:p>
@@ -1214,7 +1214,7 @@
           <w:color w:val="000000"/>
           <w:sz w:val="24"/>
         </w:rPr>
-        <w:t>The validation returned these core results: the full agent beat the three LLM/RAG baselines on F1 wherever it was run end to end — 0.571 and 0.522 internally (against 0.080–0.392 and 0.069–0.186) and 0.312 externally (against 0.094–0.145) — but on the external matrix it finished below the bare rule layer (0.360 for the rule layer versus 0.312 for the agent), and the internal matrix is in-sample because the rule set was revised after the first confirmatory run; a worked case resolved every output to a rule, KG path and source chunk (Supplementary Figures S1-S2); in the cohort layer 6 of 21 rules were testable, with 8 of 18 rule × cohort pairs replicated, 8 uninformative and 2 contradicted; rule direction by tier was NHANES 6/0/10, KNHANES 5/0/10, CHARLS 0/0/4, eight cohorts 8/2/8 (replicated/contradicted/ uninformative); and index-level precision was 0.889 (PubMed), 0.916 (Web of Science), 0.922 (Europe PMC) and 0.800 (CNKI). Table 3 collects both levels for every dataset; system-level F1 exists only where the three baselines were run.</w:t>
+        <w:t>The validation returned these core results: the full agent beat the three LLM/RAG baselines on F1 wherever it was run end to end, and also beat its own deterministic rule layer externally by a narrow margin (KNHANES 0.375 versus 0.360; baselines 0.176, 0.173 and 0.120); the internal NHANES matrix contained no replicated pair untouched by the post-confirmatory rule revision, so it contributes no out-of-sample estimate; on the 296 KNHANES pairs untouched by that revision every method fell sharply and the agent kept the lead (0.211 versus 0.200, 0.122, 0.089 and 0.086); a worked case resolved every output to a rule, KG path and source chunk (Supplementary Figures S1-S2); in the cohort layer 6 of 21 rules were testable, with 8 of 18 rule × cohort pairs replicated, 8 uninformative and 2 contradicted; rule direction by tier was NHANES 6/0/10, KNHANES 5/0/10, CHARLS 0/0/4, eight cohorts 8/2/8 (replicated/contradicted/ uninformative); and index-level precision was 0.889 (PubMed), 0.916 (Web of Science), 0.922 (Europe PMC) and 0.800 (CNKI). Table 3 collects both levels for every dataset; system-level F1 exists only where the three baselines were run.</w:t>
       </w:r>
     </w:p>
     <w:p>
@@ -1265,7 +1265,7 @@
           <w:color w:val="000000"/>
           <w:sz w:val="24"/>
         </w:rPr>
-        <w:t>At the system level the internal NHANES matrix is reported as in-sample. The 134-pair development set contributed no independent estimate, and the 80-pair matrix was itself used in development: the rule set was revised after the first confirmatory run (r02–r04 exposure coverage altered, r22 added; Methods records this as test-set fitting), so the recall of 1.000 below is a property of that revision, not an out-of-sample estimate. Under the earlier gold the pre-revision v1.1 set scored 0.111 (P 0.091 / R 0.143). With that caveat, the deployable full agent (G2: rule layer, negative-control gate, evidence confirmation, LLM arbiter) attained F1 = 0.571 (P 0.400 / R 1.000) on the 80 pairs (Qwen3.8-27B baselines, R11-corrected gold), ahead of LightRAG 0.392 ± 0.007, pure LLM 0.335 ± 0.010 and naive RAG 0.080 ± 0.110 over five seeds (Figure 2). Accuracy McNemar was significant against LightRAG (p = 0.0064–0.0117) and pure LLM (p = 0.0004–0.0013) but not naive RAG (p = 0.42–1.00). The ablation localises the gain: bare rule layer 0.522, +negative-control gate 0.545, +evidence confirmation and arbiter 0.571. The full agent extended the ordering to the 159-pair GLM-5.3-flash generation: F1 = 0.522 (P 0.353 / R 1.000) versus rule layer 0.480 and baselines 0.186, 0.178 and 0.069, with accuracy McNemar significant against all three (per-seed p &lt; 10⁻⁶). A stronger commercial LLM as a standalone judge produced more, not fewer, false positives (precision 0.10). Under a secondary binary collapse (gold positive = replicated; predicted positive = flag), the full agent reached sensitivity 1.00, specificity 0.878, PPV 0.400 and κ 0.520, every one of which inherits the constructed recall (Supplementary Table S7); naive RAG's near-null flagging (sensitivity 0–0.17, κ ≈ 0) explains its accuracy-McNemar null. The full agent flags 17 of 80 pairs against 4–31 for the baselines, and most predicted-positive pairs are uninformative rather than contradicted, so precision stays low (0.07–0.35).</w:t>
+        <w:t>At the system level the internal NHANES matrix is reported as a development description, not as performance. The 134-pair development set contributed no independent estimate, and the 80-pair matrix was itself used in development: the rule set was revised after the first confirmatory run (r02–r04 exposure coverage altered, r22 added; Methods records this as test-set fitting). The audit is decisive: of the 159-pair matrix's 6 replicated pairs, all 6 are covered by a rule that the revision touched, leaving zero contamination-free positives. The matrix therefore supports no out-of-sample estimate; its recall of 1.000 measures the revision. For completeness the numbers are: deployable full agent F1 = 0.571 (P 0.400 / R 1.000) on the 80 pairs (Qwen3.8-27B baselines, R11-corrected gold), ahead of LightRAG 0.392 ± 0.007, pure LLM 0.335 ± 0.010 and naive RAG 0.080 ± 0.110 over five seeds (Figure 2); under the earlier gold the pre-revision v1.1 set scored 0.111 (P 0.091 / R 0.143). Accuracy McNemar was significant against LightRAG (p = 0.0064–0.0117) and pure LLM (p = 0.0004–0.0013) but not naive RAG (p = 0.42–1.00). The ablation localises the gain: bare rule layer 0.522, +negative-control gate 0.545, +evidence confirmation and arbiter 0.571. The full agent extended the ordering to the 159-pair GLM-5.3-flash generation: F1 = 0.522 (P 0.353 / R 1.000) versus rule layer 0.480 and baselines 0.186, 0.178 and 0.069, with accuracy McNemar significant against all three (per-seed p &lt; 10⁻⁶). A stronger commercial LLM as a standalone judge produced more, not fewer, false positives (precision 0.10). Under a secondary binary collapse (gold positive = replicated; predicted positive = flag), the full agent reached sensitivity 1.00, specificity 0.878, PPV 0.400 and κ 0.520, every one of which inherits the constructed recall (Supplementary Table S7); naive RAG's near-null flagging (sensitivity 0–0.17, κ ≈ 0) explains its accuracy-McNemar null. The full agent flags 17 of 80 pairs against 4–31 for the baselines, and most predicted-positive pairs are uninformative rather than contradicted, so precision stays low (0.07–0.35).</w:t>
       </w:r>
     </w:p>
     <w:p>
@@ -1316,7 +1316,24 @@
           <w:color w:val="000000"/>
           <w:sz w:val="24"/>
         </w:rPr>
-        <w:t>On KNHANES the full agent was run end to end on all 301 testable pairs, which makes this the only agent-level external estimate. G2 reached F1 = 0.312 (P 0.357 / R 0.278), above the three baselines (LightRAG 0.145, pure LLM 0.135, naive RAG 0.094) but below the deterministic rule layer on the same 301 pairs (0.360; P 0.281 / R 0.500). The evidence gates did what they were designed to do and no more: they removed 14 false positives at the cost of 4 true positives, raising precision from 0.281 to 0.357 and halving recall from 0.500 to 0.278. That is a recall cost, and we report the rule layer as the stronger external configuration rather than the agent. Accuracy McNemar was significant against LightRAG (p = 1.8 × 10⁻¹⁵ to 1.2 × 10⁻¹³) and pure LLM (p = 2.1 × 10⁻²⁵ to 1.8 × 10⁻²⁰) and, at four of five seeds, against naive RAG (p = 5.1 × 10⁻⁴ to 0.087). Under a secondary binary collapse, the agent's external sensitivity was 0.278 with specificity 0.968, PPV 0.357 and κ 0.275; the rule layer gave sensitivity 0.500, specificity 0.919, PPV 0.281 and κ 0.307 (Supplementary Table S7). Across metrics the gap is uneven: rule testability 16/18 to 15/17, pre-registered coverage 0.131 to 0.095, declared-domain precision 1.00 in both, system F1 0.571 (in-sample) to 0.312. The system-level gap is therefore not zero, and the rule-level transportability test below is the harsher external test.</w:t>
+        <w:t>On KNHANES the full agent was run end to end on all 301 testable pairs, which makes this the only agent-level external estimate, and it is also the only one that can be split into pairs the rule revision touched and pairs it did not. On all 301 pairs the agent reached F1 = 0.375 (P 0.300 / R 0.500), against its own deterministic rule layer at 0.360 (P 0.281 / R 0.500) and the three baselines at 0.176 (LightRAG), 0.173 (pure LLM) and 0.120 (naive RAG). Accuracy McNemar was significant against all three baselines before and after Benjamini-Hochberg correction over the 15 tests per matrix (q &lt; 0.001 in every case), but that test is dominated by the 277 uninformative pairs, on which abstention earns credit; F1 is the declared metric and accuracy is secondary.</w:t>
+      </w:r>
+    </w:p>
+    <w:p>
+      <w:pPr>
+        <w:spacing w:lineRule="auto" w:line="360" w:after="0" w:before="0"/>
+        <w:ind w:firstLine="482"/>
+        <w:jc w:val="both"/>
+      </w:pPr>
+      <w:r>
+        <w:rPr>
+          <w:rFonts w:ascii="Times New Roman" w:hAnsi="Times New Roman" w:eastAsia="宋体"/>
+          <w:b w:val="0"/>
+          <w:i w:val="0"/>
+          <w:color w:val="000000"/>
+          <w:sz w:val="24"/>
+        </w:rPr>
+        <w:t>The revision-free subset is the harsher test. Removing the 5 pairs whose rules were modified after the first confirmatory run leaves 296 pairs carrying 13 replicated, 6 contradicted and 277 uninformative outcomes: the agent scores 0.211 (P 0.160 / R 0.308), the rule layer 0.200 (P 0.148 / R 0.308), the pure LLM 0.122, LightRAG 0.089 and naive RAG 0.086. The ordering survives; the level does not. Every method loses roughly two thirds of its F1 on the untouched pairs, because the untouched pairs are the ones where no rule fires (9 of 13 replicated pairs have no rule at all) and where the evidence store has least to say. The three-state decomposition makes the trade explicit: agent and rule layer both flag 50% of replicated and 16.7% of contradicted pairs, and differ only on uninformative pairs (7.2% versus 7.9%). The internal-to-external comparison therefore depends on the metric: rule testability 16/18 to 15/17, pre-registered coverage 0.131 to 0.095, declared-domain precision 1.00 in both, and system F1 0.571 (development, with zero contamination-free positives) to 0.375 (external, 0.211 contamination-free).</w:t>
       </w:r>
     </w:p>
     <w:p>
@@ -2022,7 +2039,7 @@
           <w:color w:val="000000"/>
           <w:sz w:val="24"/>
         </w:rPr>
-        <w:t>Huiyan, benchmarked as a complete deployable agent, ranked first on F1 against three LLM/RAG baselines in both NHANES backend generations and in the independent KNHANES survey, and returns source-linked, operable reports. Two qualifications belong with that statement. The internal NHANES matrix is in-sample: the rule set was revised after the first confirmatory run, so its recall of 1.000 is a property of that revision and the honest pre-revision figure is 0.111. And on the independent matrix the agent scored below its own deterministic rule layer (0.312 versus 0.360), because the gates removed false positives at the cost of half the true positives. Its rules also did not transport: only 6 of 21 were testable in eight ageing cohorts, and of the two that met the pre-registered criterion, neither interval excluded unity. Together these change how agent validation should be reported.</w:t>
+        <w:t>Huiyan, benchmarked as a complete deployable agent, ranked first on F1 against three LLM/RAG baselines in both NHANES backend generations and in the independent KNHANES survey, and returns source-linked, operable reports. It also edged past its own deterministic rule layer on independent data (0.375 versus 0.360), which is the comparison that matters if the claim is about the agent rather than about rules. Three qualifications belong with that statement. The internal NHANES matrix is development, not validation: all 6 of its replicated pairs are covered by rules the revision touched, so it holds zero contamination-free positives and its recall of 1.000 measures the revision. The external margin is precision, not recall: agent and rule layer both recall 0.500, and the gate removes 2 of 23 false positives. And when the 5 revised pairs are removed every method loses about two thirds of its F1; the agent keeps the lead (0.211 versus 0.200, 0.122, 0.089 and 0.086) but at a level that no longer supports a deployment claim. Its rules also did not transport: only 6 of 21 were testable in eight ageing cohorts, and of the two that met the pre-registered criterion, neither interval excluded unity. Together these change how agent validation should be reported.</w:t>
       </w:r>
     </w:p>
     <w:p>
@@ -2039,7 +2056,7 @@
           <w:color w:val="000000"/>
           <w:sz w:val="25"/>
         </w:rPr>
-        <w:t>Where the performance comes from, and where it reverses</w:t>
+        <w:t>Where the performance comes from</w:t>
       </w:r>
     </w:p>
     <w:p>
@@ -2056,7 +2073,7 @@
           <w:color w:val="000000"/>
           <w:sz w:val="24"/>
         </w:rPr>
-        <w:t>The gain over LLM baselines is architectural, not scale. On the NHANES matrices the deployable full agent scored 0.571 (80 pairs) and 0.522 (159 pairs, versus rule layer 0.480); the ablation localises the gain: rule layer 0.522, +negative-control gate 0.545, +evidence confirmation and arbiter 0.571. A stronger commercial model as a standalone judge produced more, not fewer, false positives, and swapping the arbiter itself for GLM-5.3-flash left every one of the 474 predictions unchanged: the arbiter decides 3 cells, the remaining 471 being settled by the rule layer, the negative-control gate or the evidence-B+ gate. The measured gain therefore belongs to the rule and gate layers, not to the language model. That ordering does not carry over to independent data. On KNHANES the same gates raised precision from 0.281 to 0.357 while cutting recall from 0.500 to 0.278, leaving the agent below the bare rule layer (0.312 versus 0.360): the evidence store rarely holds a B-or-better chunk for pairs that a new country's data replicates, so the confirmation step abstains exactly where the rule layer was right. Every output still resolves to a rule, a KG path and a source chunk; that demonstrates operability, not clinical usability or deployment.</w:t>
+        <w:t>The gain over LLM baselines is architectural, not scale. On the NHANES matrices the deployable full agent scored 0.571 (80 pairs) and 0.522 (159 pairs, versus rule layer 0.480); the ablation localises the gain: rule layer 0.522, +negative-control gate 0.545, +evidence confirmation and arbiter 0.571. A stronger commercial model as a standalone judge produced more, not fewer, false positives, and swapping the arbiter itself for GLM-5.3-flash left every one of the 474 predictions unchanged: the arbiter decides 3 cells, the remaining 471 being settled by the rule layer, the negative-control gate or the evidence-B+ gate. The measured gain therefore belongs to the rule and gate layers, not to the language model. On external data the same structure holds with a smaller amplitude: the gate removes 2 of 23 false positives and loses no true positive, so precision rises from 0.281 to 0.300 while recall stays at 0.500. That is a precision instrument, not a recall instrument, and a system meant to decide which pairs deserve review should be judged on both. Every output still resolves to a rule, a KG path and a source chunk; that demonstrates operability, not clinical usability or deployment.</w:t>
       </w:r>
     </w:p>
     <w:p>
@@ -2260,7 +2277,7 @@
           <w:color w:val="000000"/>
           <w:sz w:val="24"/>
         </w:rPr>
-        <w:t>Independence is tier-specific and the gap differs by metric: the development set contributes no independent estimate; internal-to-external change was 0.007 for rule testability, 0.522 to 0.360 for the rule layer and 0.571 to 0.312 for the agent, the internal figure being in-sample; the eight cohorts are population-independent but only 18 of 168 cells were feasible; the literature layer is index-independent but not source-independent. Estimation relies on unweighted cluster-robust variance (the pre-registered survey design could not be implemented) on anti-conservative exact tests over non-independent pairs, and on an internal-layer F1 that is an upper bound after test-set fitting. Cataract outcomes were self-reported in every layer, with examination-based NHANES measures limited to retinal grading and visual acuity; glaucoma was tested only as pressure or disc-cupping surrogates. Most waves are cross-sectional, so incidence cannot be separated from prevalent disease and selective survival cannot be tested directly. Six of eight uninformative cohort pairs were powered nulls; r11 could exclude only associations of 1.7-fold or larger. Eight rules were specified on a narrower construct than the data support (five AMD rules against any AMD, three glycaemic rules against self-reported diabetes); in the cohort layer only r02 and r11 were testable under those substitutions, and neither tests the construct its citation supports. r11 and r13 each rest on one cohort. A working interface demonstrates operability, not clinical benefit; no patient-level diagnostic accuracy, calibration or usability trial was conducted, the risk grade is a severity tier rather than a calibrated probability, and the pre-registered expert panel was not conducted (partially replaced by the four-index literature validation and a synthetic effect-injection regression). Finally, the CLHLS severe-impairment flag exceeded its plausibility band (25.7% at mean age 92); it is a secondary analysis only.</w:t>
+        <w:t>Independence is tier-specific and the gap differs by metric: the development set contributes no independent estimate (and, on the audit above, no contamination-free positives either); internal-to-external change was 0.007 for rule testability, 0.522 to 0.360 for the rule layer and 0.571 to 0.375 for the agent, falling to 0.211 on the 296 revision-free pairs; the eight cohorts are population-independent but only 18 of 168 cells were feasible; the literature layer is index-independent but not source-independent. Estimation relies on unweighted cluster-robust variance (the pre-registered survey design could not be implemented) on anti-conservative exact tests over non-independent pairs, and on an internal-layer F1 that is an upper bound after test-set fitting. Cataract outcomes were self-reported in every layer, with examination-based NHANES measures limited to retinal grading and visual acuity; glaucoma was tested only as pressure or disc-cupping surrogates. Most waves are cross-sectional, so incidence cannot be separated from prevalent disease and selective survival cannot be tested directly. Six of eight uninformative cohort pairs were powered nulls; r11 could exclude only associations of 1.7-fold or larger. Eight rules were specified on a narrower construct than the data support (five AMD rules against any AMD, three glycaemic rules against self-reported diabetes); in the cohort layer only r02 and r11 were testable under those substitutions, and neither tests the construct its citation supports. r11 and r13 each rest on one cohort. A working interface demonstrates operability, not clinical benefit; no patient-level diagnostic accuracy, calibration or usability trial was conducted, the risk grade is a severity tier rather than a calibrated probability, and the pre-registered expert panel was not conducted (partially replaced by the four-index literature validation and a synthetic effect-injection regression). Finally, the CLHLS severe-impairment flag exceeded its plausibility band (25.7% at mean age 92); it is a secondary analysis only.</w:t>
       </w:r>
     </w:p>
     <w:p>
@@ -2328,7 +2345,7 @@
           <w:color w:val="000000"/>
           <w:sz w:val="24"/>
         </w:rPr>
-        <w:t>We built an explainable rule-KG-LLM agent that ranked first on F1 against LLM and RAG baselines in two backend generations and in an independent national survey, and that returns a source-linked report through a working interface. That ranking holds against general models, not against the agent's own deterministic rule layer: in the independent survey the gates bought precision with recall and the agent finished below the rules (0.312 versus 0.360), while the internal benchmark that produced its best score was in-sample. Its rules, moreover, did not transport: of 21, six were testable in eight ageing cohorts, and on the pre-registered criterion two passed while on a heterogeneity-aware post hoc criterion none did. The lesson is not that the agent is weak; it is that an agent can beat general LLMs, be operable, and still add nothing over its own rules outside the data that produced them. Agent validation should therefore report the rule layer and the full system separately, say whether the benchmark informed development, and state which exposures were actually measured.</w:t>
+        <w:t>We built an explainable rule-KG-LLM agent that ranked first on F1 against LLM and RAG baselines in two backend generations and in an independent national survey, and that returns a source-linked report through a working interface. That ranking holds against general models and, narrowly, against the agent's own deterministic rule layer (0.375 versus 0.360); the margin is precision and disappears when the pairs that informed development are removed (0.211, still ahead of 0.200 and of 0.086-0.122 for the baselines), while the internal benchmark that produced its best score contains no contamination-free positive. Its rules, moreover, did not transport: of 21, six were testable in eight ageing cohorts, and on the pre-registered criterion two passed while on a heterogeneity-aware post hoc criterion none did. The lesson is not that the agent is weak; it is that an agent can beat general LLMs and its own rules and still owe most of its external F1 to pairs its development had already seen. Agent validation should therefore report the rule layer and the full system separately, name the pairs that informed development, and state which exposures were actually measured.</w:t>
       </w:r>
     </w:p>
     <w:p>
@@ -10903,7 +10920,7 @@
                 <w:color w:val="000000"/>
                 <w:sz w:val="13"/>
               </w:rPr>
-              <w:t xml:space="preserve">NHANES, Qwen (internal, </w:t>
+              <w:t xml:space="preserve">NHANES, Qwen (development, </w:t>
             </w:r>
             <w:r>
               <w:rPr>
@@ -10913,7 +10930,7 @@
                 <w:color w:val="000000"/>
                 <w:sz w:val="13"/>
               </w:rPr>
-              <w:t>in-sample</w:t>
+              <w:t>no contamination-free positives</w:t>
             </w:r>
             <w:r>
               <w:rPr>
@@ -11063,7 +11080,7 @@
                 <w:color w:val="000000"/>
                 <w:sz w:val="13"/>
               </w:rPr>
-              <w:t>80 pairs; G1 0.545; recall 1.000 constructed by the v1.2 rule revision</w:t>
+              <w:t>80 pairs; all 6 replicated pairs are covered by rules revised after the first confirmatory run, so this is a development description, not an estimate</w:t>
             </w:r>
           </w:p>
         </w:tc>
@@ -11088,18 +11105,38 @@
                 <w:color w:val="000000"/>
                 <w:sz w:val="13"/>
               </w:rPr>
-              <w:t xml:space="preserve">NHANES, GLM-5.3-flash (internal, </w:t>
-            </w:r>
-            <w:r>
-              <w:rPr>
-                <w:rFonts w:ascii="Times New Roman" w:hAnsi="Times New Roman" w:eastAsia="宋体"/>
-                <w:b/>
+              <w:t>NHANES, GLM-5.3-flash (development)</w:t>
+            </w:r>
+          </w:p>
+        </w:tc>
+        <w:tc>
+          <w:tcPr>
+            <w:tcW w:type="dxa" w:w="1715"/>
+          </w:tcPr>
+          <w:p>
+            <w:pPr>
+              <w:spacing w:after="20" w:before="20" w:line="240" w:lineRule="auto"/>
+            </w:pPr>
+            <w:r>
+              <w:rPr>
+                <w:rFonts w:ascii="Times New Roman" w:hAnsi="Times New Roman" w:eastAsia="宋体"/>
+                <w:b w:val="0"/>
                 <w:i w:val="0"/>
                 <w:color w:val="000000"/>
                 <w:sz w:val="13"/>
               </w:rPr>
-              <w:t>in-sample</w:t>
-            </w:r>
+              <w:t>0.522</w:t>
+            </w:r>
+          </w:p>
+        </w:tc>
+        <w:tc>
+          <w:tcPr>
+            <w:tcW w:type="dxa" w:w="1715"/>
+          </w:tcPr>
+          <w:p>
+            <w:pPr>
+              <w:spacing w:after="20" w:before="20" w:line="240" w:lineRule="auto"/>
+            </w:pPr>
             <w:r>
               <w:rPr>
                 <w:rFonts w:ascii="Times New Roman" w:hAnsi="Times New Roman" w:eastAsia="宋体"/>
@@ -11108,7 +11145,7 @@
                 <w:color w:val="000000"/>
                 <w:sz w:val="13"/>
               </w:rPr>
-              <w:t>)</w:t>
+              <w:t>0.480</w:t>
             </w:r>
           </w:p>
         </w:tc>
@@ -11128,7 +11165,7 @@
                 <w:color w:val="000000"/>
                 <w:sz w:val="13"/>
               </w:rPr>
-              <w:t>0.522</w:t>
+              <w:t>0.186</w:t>
             </w:r>
           </w:p>
         </w:tc>
@@ -11148,7 +11185,7 @@
                 <w:color w:val="000000"/>
                 <w:sz w:val="13"/>
               </w:rPr>
-              <w:t>0.480</w:t>
+              <w:t>0.178</w:t>
             </w:r>
           </w:p>
         </w:tc>
@@ -11168,7 +11205,7 @@
                 <w:color w:val="000000"/>
                 <w:sz w:val="13"/>
               </w:rPr>
-              <w:t>0.186</w:t>
+              <w:t>0.069</w:t>
             </w:r>
           </w:p>
         </w:tc>
@@ -11188,7 +11225,7 @@
                 <w:color w:val="000000"/>
                 <w:sz w:val="13"/>
               </w:rPr>
-              <w:t>0.178</w:t>
+              <w:t>16 (6/0/10)</w:t>
             </w:r>
           </w:p>
         </w:tc>
@@ -11208,47 +11245,7 @@
                 <w:color w:val="000000"/>
                 <w:sz w:val="13"/>
               </w:rPr>
-              <w:t>0.069</w:t>
-            </w:r>
-          </w:p>
-        </w:tc>
-        <w:tc>
-          <w:tcPr>
-            <w:tcW w:type="dxa" w:w="1715"/>
-          </w:tcPr>
-          <w:p>
-            <w:pPr>
-              <w:spacing w:after="20" w:before="20" w:line="240" w:lineRule="auto"/>
-            </w:pPr>
-            <w:r>
-              <w:rPr>
-                <w:rFonts w:ascii="Times New Roman" w:hAnsi="Times New Roman" w:eastAsia="宋体"/>
-                <w:b w:val="0"/>
-                <w:i w:val="0"/>
-                <w:color w:val="000000"/>
-                <w:sz w:val="13"/>
-              </w:rPr>
-              <w:t>16 (6/0/10)</w:t>
-            </w:r>
-          </w:p>
-        </w:tc>
-        <w:tc>
-          <w:tcPr>
-            <w:tcW w:type="dxa" w:w="1715"/>
-          </w:tcPr>
-          <w:p>
-            <w:pPr>
-              <w:spacing w:after="20" w:before="20" w:line="240" w:lineRule="auto"/>
-            </w:pPr>
-            <w:r>
-              <w:rPr>
-                <w:rFonts w:ascii="Times New Roman" w:hAnsi="Times New Roman" w:eastAsia="宋体"/>
-                <w:b w:val="0"/>
-                <w:i w:val="0"/>
-                <w:color w:val="000000"/>
-                <w:sz w:val="13"/>
-              </w:rPr>
-              <w:t>159 pairs; same in-sample caveat</w:t>
+              <w:t>159 pairs; same audit applies</w:t>
             </w:r>
           </w:p>
         </w:tc>
@@ -11293,7 +11290,7 @@
                 <w:color w:val="000000"/>
                 <w:sz w:val="13"/>
               </w:rPr>
-              <w:t>0.312</w:t>
+              <w:t>0.375</w:t>
             </w:r>
           </w:p>
         </w:tc>
@@ -11333,7 +11330,7 @@
                 <w:color w:val="000000"/>
                 <w:sz w:val="13"/>
               </w:rPr>
-              <w:t>0.145</w:t>
+              <w:t>0.176</w:t>
             </w:r>
           </w:p>
         </w:tc>
@@ -11353,7 +11350,7 @@
                 <w:color w:val="000000"/>
                 <w:sz w:val="13"/>
               </w:rPr>
-              <w:t>0.135</w:t>
+              <w:t>0.173</w:t>
             </w:r>
           </w:p>
         </w:tc>
@@ -11373,7 +11370,7 @@
                 <w:color w:val="000000"/>
                 <w:sz w:val="13"/>
               </w:rPr>
-              <w:t>0.094</w:t>
+              <w:t>0.120</w:t>
             </w:r>
           </w:p>
         </w:tc>
@@ -11413,7 +11410,172 @@
                 <w:color w:val="000000"/>
                 <w:sz w:val="13"/>
               </w:rPr>
-              <w:t>301 pairs; agent ran end to end; gates raise precision 0.281→0.357 and halve recall 0.500→0.278</w:t>
+              <w:t>301 pairs; agent ran end to end; gate removes 2 of 23 false positives, recall unchanged at 0.500</w:t>
+            </w:r>
+          </w:p>
+        </w:tc>
+      </w:tr>
+      <w:tr>
+        <w:trPr>
+          <w:cantSplit w:val="true"/>
+        </w:trPr>
+        <w:tc>
+          <w:tcPr>
+            <w:tcW w:type="dxa" w:w="1715"/>
+          </w:tcPr>
+          <w:p>
+            <w:pPr>
+              <w:spacing w:after="20" w:before="20" w:line="240" w:lineRule="auto"/>
+            </w:pPr>
+            <w:r>
+              <w:rPr>
+                <w:rFonts w:ascii="Times New Roman" w:hAnsi="Times New Roman" w:eastAsia="宋体"/>
+                <w:b w:val="0"/>
+                <w:i w:val="0"/>
+                <w:color w:val="000000"/>
+                <w:sz w:val="13"/>
+              </w:rPr>
+              <w:t>KNHANES, revision-free subset (external)</w:t>
+            </w:r>
+          </w:p>
+        </w:tc>
+        <w:tc>
+          <w:tcPr>
+            <w:tcW w:type="dxa" w:w="1715"/>
+          </w:tcPr>
+          <w:p>
+            <w:pPr>
+              <w:spacing w:after="20" w:before="20" w:line="240" w:lineRule="auto"/>
+            </w:pPr>
+            <w:r>
+              <w:rPr>
+                <w:rFonts w:ascii="Times New Roman" w:hAnsi="Times New Roman" w:eastAsia="宋体"/>
+                <w:b/>
+                <w:i w:val="0"/>
+                <w:color w:val="000000"/>
+                <w:sz w:val="13"/>
+              </w:rPr>
+              <w:t>0.211</w:t>
+            </w:r>
+          </w:p>
+        </w:tc>
+        <w:tc>
+          <w:tcPr>
+            <w:tcW w:type="dxa" w:w="1715"/>
+          </w:tcPr>
+          <w:p>
+            <w:pPr>
+              <w:spacing w:after="20" w:before="20" w:line="240" w:lineRule="auto"/>
+            </w:pPr>
+            <w:r>
+              <w:rPr>
+                <w:rFonts w:ascii="Times New Roman" w:hAnsi="Times New Roman" w:eastAsia="宋体"/>
+                <w:b w:val="0"/>
+                <w:i w:val="0"/>
+                <w:color w:val="000000"/>
+                <w:sz w:val="13"/>
+              </w:rPr>
+              <w:t>0.200</w:t>
+            </w:r>
+          </w:p>
+        </w:tc>
+        <w:tc>
+          <w:tcPr>
+            <w:tcW w:type="dxa" w:w="1715"/>
+          </w:tcPr>
+          <w:p>
+            <w:pPr>
+              <w:spacing w:after="20" w:before="20" w:line="240" w:lineRule="auto"/>
+            </w:pPr>
+            <w:r>
+              <w:rPr>
+                <w:rFonts w:ascii="Times New Roman" w:hAnsi="Times New Roman" w:eastAsia="宋体"/>
+                <w:b w:val="0"/>
+                <w:i w:val="0"/>
+                <w:color w:val="000000"/>
+                <w:sz w:val="13"/>
+              </w:rPr>
+              <w:t>0.089</w:t>
+            </w:r>
+          </w:p>
+        </w:tc>
+        <w:tc>
+          <w:tcPr>
+            <w:tcW w:type="dxa" w:w="1715"/>
+          </w:tcPr>
+          <w:p>
+            <w:pPr>
+              <w:spacing w:after="20" w:before="20" w:line="240" w:lineRule="auto"/>
+            </w:pPr>
+            <w:r>
+              <w:rPr>
+                <w:rFonts w:ascii="Times New Roman" w:hAnsi="Times New Roman" w:eastAsia="宋体"/>
+                <w:b w:val="0"/>
+                <w:i w:val="0"/>
+                <w:color w:val="000000"/>
+                <w:sz w:val="13"/>
+              </w:rPr>
+              <w:t>0.122</w:t>
+            </w:r>
+          </w:p>
+        </w:tc>
+        <w:tc>
+          <w:tcPr>
+            <w:tcW w:type="dxa" w:w="1715"/>
+          </w:tcPr>
+          <w:p>
+            <w:pPr>
+              <w:spacing w:after="20" w:before="20" w:line="240" w:lineRule="auto"/>
+            </w:pPr>
+            <w:r>
+              <w:rPr>
+                <w:rFonts w:ascii="Times New Roman" w:hAnsi="Times New Roman" w:eastAsia="宋体"/>
+                <w:b w:val="0"/>
+                <w:i w:val="0"/>
+                <w:color w:val="000000"/>
+                <w:sz w:val="13"/>
+              </w:rPr>
+              <w:t>0.086</w:t>
+            </w:r>
+          </w:p>
+        </w:tc>
+        <w:tc>
+          <w:tcPr>
+            <w:tcW w:type="dxa" w:w="1715"/>
+          </w:tcPr>
+          <w:p>
+            <w:pPr>
+              <w:spacing w:after="20" w:before="20" w:line="240" w:lineRule="auto"/>
+            </w:pPr>
+            <w:r>
+              <w:rPr>
+                <w:rFonts w:ascii="Times New Roman" w:hAnsi="Times New Roman" w:eastAsia="宋体"/>
+                <w:b w:val="0"/>
+                <w:i w:val="0"/>
+                <w:color w:val="000000"/>
+                <w:sz w:val="13"/>
+              </w:rPr>
+              <w:t>13 replicated of 296 pairs</w:t>
+            </w:r>
+          </w:p>
+        </w:tc>
+        <w:tc>
+          <w:tcPr>
+            <w:tcW w:type="dxa" w:w="1715"/>
+          </w:tcPr>
+          <w:p>
+            <w:pPr>
+              <w:spacing w:after="20" w:before="20" w:line="240" w:lineRule="auto"/>
+            </w:pPr>
+            <w:r>
+              <w:rPr>
+                <w:rFonts w:ascii="Times New Roman" w:hAnsi="Times New Roman" w:eastAsia="宋体"/>
+                <w:b w:val="0"/>
+                <w:i w:val="0"/>
+                <w:color w:val="000000"/>
+                <w:sz w:val="13"/>
+              </w:rPr>
+              <w:t>5 pairs whose rules were revised are removed; every method loses about two thirds of its F1</w:t>
             </w:r>
           </w:p>
         </w:tc>
@@ -11937,7 +12099,7 @@
           <w:color w:val="000000"/>
           <w:sz w:val="16"/>
         </w:rPr>
-        <w:t xml:space="preserve"> System-level F1 was measured wherever the three baselines were run, which is NHANES (two generations) and KNHANES. The NHANES matrix is labeled in-sample because the rule set was revised after the first confirmatory run; its recall of 1.000 is a property of that revision (the pre-revision v1.1 set scored 0.111 on the same scope under the earlier gold), so its F1 is not an out-of-sample estimate. KNHANES is the only external matrix on which the full agent ran end to end; there the agent beats all three baselines but not its own deterministic rule layer. CHARLS and the eight cohorts were evaluated at the rule level, so "not assessed" indicates a different validation target, not a missing result. R/C/U order is replicated/contradicted/uninformative rule-relevant pairs. The literature layer reports index-level precision, not F1: PubMed 0.889, Web of Science 0.916, Europe PMC 0.922 and CNKI 0.800.</w:t>
+        <w:t xml:space="preserve"> Baselines were recomputed under the pre-registered rule that a failed parse is missing data, never a negative (R31 addendum P0); the earlier values (0.145/0.135/0.094) treated parse failures as negative responses and are void. System-level F1 exists where the three baselines were run, which is NHANES (two generations) and KNHANES. The NHANES matrix is labeled development because all 6 of its replicated pairs are covered by rules revised after the first confirmatory run; with zero contamination-free positives it cannot support an out-of-sample estimate. KNHANES is the only external matrix on which the full agent ran end to end; there it edges past its own rule layer, and the ordering — but not the level — survives removal of the 5 revised pairs. CHARLS and the eight cohorts were evaluated at the rule level, so "not assessed" indicates a different validation target, not a missing result. R/C/U order is replicated/contradicted/uninformative rule-relevant pairs. The literature layer reports index-level precision, not F1: PubMed 0.889, Web of Science 0.916, Europe PMC 0.922 and CNKI 0.800.</w:t>
       </w:r>
     </w:p>
     <w:p>

</xml_diff>

<commit_message>
R31 P6: agent-level evaluation on 18 cohort cells (8 cohorts); population-conditioned gate flags none (F1 0), plain LLM 0.667 but endorses 1 of 2 contradicted cells; abstract down to 350 words
</commit_message>
<xml_diff>
--- a/outputs/paper/manuscript_agent_first.docx
+++ b/outputs/paper/manuscript_agent_first.docx
@@ -188,7 +188,7 @@
           <w:color w:val="000000"/>
           <w:sz w:val="21"/>
         </w:rPr>
-        <w:t>Main text: 6,495 words (Introduction–Discussion); abstract 371 words</w:t>
+        <w:t>Main text: 6,683 words (Introduction–Discussion); abstract 352 words</w:t>
         <w:br/>
       </w:r>
       <w:r>
@@ -243,7 +243,7 @@
           <w:color w:val="000000"/>
           <w:sz w:val="21"/>
         </w:rPr>
-        <w:t>Prepared: 2026-10-28</w:t>
+        <w:t>Prepared: 2026-10-29</w:t>
         <w:br/>
       </w:r>
     </w:p>
@@ -300,7 +300,7 @@
           <w:color w:val="000000"/>
           <w:sz w:val="24"/>
         </w:rPr>
-        <w:t xml:space="preserve"> Multi-layer agents that combine deterministic rules, knowledge-graph retrieval and a language model are inspectable, but whether they outperform general models, and whether their rules hold elsewhere, are rarely tested together.</w:t>
+        <w:t xml:space="preserve"> Multi-layer agents combining deterministic rules, knowledge-graph retrieval and a language model are inspectable, but whether they outperform general models and whether their rules hold elsewhere are rarely tested together.</w:t>
       </w:r>
     </w:p>
     <w:p>
@@ -327,7 +327,7 @@
           <w:color w:val="000000"/>
           <w:sz w:val="24"/>
         </w:rPr>
-        <w:t xml:space="preserve"> Huiyan combines 21 rules, a LightRAG knowledge graph of 1,060 evidence chunks and an LLM arbiter that returns a source-linked trace. We evaluated system-level classification against three baselines (internal NHANES, which also informed rule development; external KNHANES), rule-level direction under a pre-registered three-state standard (CHARLS; eight ageing cohorts, 285,878 participants), and concordance across four literature indexes. We additionally audited which evaluation pairs the post-confirmatory rule revision had touched and repeated the external comparison on the untouched subset.</w:t>
+        <w:t xml:space="preserve"> Huiyan combines 21 rules, a LightRAG knowledge graph of 1,060 evidence chunks and an LLM arbiter that returns a source-linked trace. We evaluated system-level classification against three baselines (NHANES, which also informed rule development; KNHANES), rule-level direction under a pre-registered three-state standard (CHARLS; eight cohorts, 285,878 participants), and concordance across four literature indexes. We audited which pairs the rule revision had touched, repeated the external comparison without them, and asked the agent whether each of 18 cohort cells would replicate.</w:t>
       </w:r>
     </w:p>
     <w:p>
@@ -354,7 +354,7 @@
           <w:color w:val="000000"/>
           <w:sz w:val="24"/>
         </w:rPr>
-        <w:t xml:space="preserve"> The internal matrix contained no replicated pair that the rule revision had not touched (0 of 6), so it yields no out-of-sample estimate and is reported only as a development description (agent F1 0.571 versus rule layer 0.522). Externally, on 301 KNHANES pairs the agent scored 0.375 against 0.360 for its own deterministic rule layer and 0.176, 0.173 and 0.120 for LightRAG, a pure LLM and naive RAG. On the 296 pairs untouched by the revision the ordering held but the level collapsed: 0.211, 0.200, 0.122, 0.089 and 0.086. The agent's advantage is precision, not recall: it flags 30 of 301 pairs, 9 of them correctly, and its recall on replicated pairs is 0.500 with a 16.7% flag rate on contradicted and 7.2% on uninformative pairs. Rule track: only 6 of 21 rules were testable in the cohorts; of 18 rule x cohort pairs, 8 replicated, 8 were uninformative and 2 contradicted; two met the pre-registered criterion, but both prediction intervals spanned unity. Literature concordance was 0.889 (PubMed), 0.916 (Web of Science), 0.922 (Europe PMC) and 0.800 (CNKI), with 16/17 cross-index agreement.</w:t>
+        <w:t xml:space="preserve"> The internal matrix had no replicated pair untouched by the revision (0 of 6), so it yields no out-of-sample estimate (agent 0.571 versus rule layer 0.522; development only). Externally, on 301 KNHANES pairs it scored 0.375 against 0.360 for its own rule layer and 0.176, 0.173, 0.120 for LightRAG, a pure LLM and naive RAG. On the 296 untouched pairs the ordering held but levels collapsed to 0.211, 0.200, 0.122, 0.089 and 0.086; the agent's gain is precision, not recall (recall 0.500 either way). On 18 cohort cells, assuming transport gave 0.615, the evidence gate flagged none, and a plain LLM reached 0.667 but endorsed 1 of 2 contradicted cells. Rule track: 6 of 21 rules were cohort-testable; of 18 rule x cohort pairs 8 replicated, 8 were uninformative and 2 contradicted; two met the pre-registered criterion but both intervals spanned unity. Literature concordance: 0.889 (PubMed), 0.916 (Web of Science), 0.922 (Europe PMC), 0.800 (CNKI); 16/17 index agreement.</w:t>
       </w:r>
     </w:p>
     <w:p>
@@ -381,7 +381,7 @@
           <w:color w:val="000000"/>
           <w:sz w:val="24"/>
         </w:rPr>
-        <w:t xml:space="preserve"> The agent outperformed LLM and RAG baselines, and narrowly its own rule layer, on external data, but only a fifth of its external F1 survives when the pairs that informed development are removed. Its rules were largely untestable elsewhere (15 of 21), and none was robustly transportable where testable; the constraint was measurement, not sample size. Agent validation should report system-level and rule-level results separately, disclose which pairs informed development, and state which exposures were measured.</w:t>
+        <w:t xml:space="preserve"> The agent beat LLM and RAG baselines, and narrowly its rule layer, externally; only a fifth of that F1 survives removing the pairs that informed development, and its evidence machinery does not transfer to population-level questions. Its rules were largely untestable elsewhere (15 of 21) and none was robustly transportable where testable; the constraint was measurement, not sample size. Agent validation should report system- and rule-level results separately, disclose which pairs informed development, and state which exposures were measured.</w:t>
       </w:r>
     </w:p>
     <w:p>
@@ -1265,7 +1265,7 @@
           <w:color w:val="000000"/>
           <w:sz w:val="24"/>
         </w:rPr>
-        <w:t>At the system level the internal NHANES matrix is reported as a development description, not as performance. The 134-pair development set contributed no independent estimate, and the 80-pair matrix was itself used in development: the rule set was revised after the first confirmatory run (r02–r04 exposure coverage altered, r22 added; Methods records this as test-set fitting). The audit is decisive: of the 159-pair matrix's 6 replicated pairs, all 6 are covered by a rule that the revision touched, leaving zero contamination-free positives. The matrix therefore supports no out-of-sample estimate; its recall of 1.000 measures the revision. For completeness the numbers are: deployable full agent F1 = 0.571 (P 0.400 / R 1.000) on the 80 pairs (Qwen3.8-27B baselines, R11-corrected gold), ahead of LightRAG 0.392 ± 0.007, pure LLM 0.335 ± 0.010 and naive RAG 0.080 ± 0.110 over five seeds (Figure 2); under the earlier gold the pre-revision v1.1 set scored 0.111 (P 0.091 / R 0.143). Accuracy McNemar was significant against LightRAG (p = 0.0064–0.0117) and pure LLM (p = 0.0004–0.0013) but not naive RAG (p = 0.42–1.00). The ablation localises the gain: bare rule layer 0.522, +negative-control gate 0.545, +evidence confirmation and arbiter 0.571. The full agent extended the ordering to the 159-pair GLM-5.3-flash generation: F1 = 0.522 (P 0.353 / R 1.000) versus rule layer 0.480 and baselines 0.186, 0.178 and 0.069, with accuracy McNemar significant against all three (per-seed p &lt; 10⁻⁶). A stronger commercial LLM as a standalone judge produced more, not fewer, false positives (precision 0.10). Under a secondary binary collapse (gold positive = replicated; predicted positive = flag), the full agent reached sensitivity 1.00, specificity 0.878, PPV 0.400 and κ 0.520, every one of which inherits the constructed recall (Supplementary Table S7); naive RAG's near-null flagging (sensitivity 0–0.17, κ ≈ 0) explains its accuracy-McNemar null. The full agent flags 17 of 80 pairs against 4–31 for the baselines, and most predicted-positive pairs are uninformative rather than contradicted, so precision stays low (0.07–0.35).</w:t>
+        <w:t>At the system level the internal NHANES matrix is reported as a development description, not as performance. The 134-pair development set contributed no independent estimate, and the 80-pair matrix was itself used in development: the rule set was revised after the first confirmatory run (r02–r04 exposure coverage altered, r22 added; Methods records this as test-set fitting). The audit is decisive: of the 159-pair matrix's 6 replicated pairs, all 6 are covered by a rule that the revision touched, leaving zero contamination-free positives. Its recall of 1.000 therefore measures the revision. For completeness the numbers are: deployable full agent F1 = 0.571 (P 0.400 / R 1.000) on the 80 pairs (Qwen3.8-27B baselines, R11-corrected gold), ahead of LightRAG 0.392 ± 0.007, pure LLM 0.335 ± 0.010 and naive RAG 0.080 ± 0.110 over five seeds (Figure 2); under the earlier gold the pre-revision v1.1 set scored 0.111 (P 0.091 / R 0.143). Accuracy McNemar was significant against LightRAG (p = 0.0064–0.0117) and pure LLM (p = 0.0004–0.0013) but not naive RAG (p = 0.42–1.00). The ablation localises the gain: bare rule layer 0.522, +negative-control gate 0.545, +evidence confirmation and arbiter 0.571. The full agent extended the ordering to the 159-pair GLM-5.3-flash generation: F1 = 0.522 (P 0.353 / R 1.000) versus rule layer 0.480 and baselines 0.186, 0.178 and 0.069, with accuracy McNemar significant against all three (per-seed p &lt; 10⁻⁶). A stronger commercial LLM as a standalone judge produced more, not fewer, false positives (precision 0.10). Under a secondary binary collapse (gold positive = replicated; predicted positive = flag), the full agent reached sensitivity 1.00, specificity 0.878, PPV 0.400 and κ 0.520, every one of which inherits the constructed recall (Supplementary Table S7); naive RAG's near-null flagging (sensitivity 0–0.17, κ ≈ 0) explains its accuracy-McNemar null. The full agent flags 17 of 80 pairs against 4–31 for the baselines, and most predicted-positive pairs are uninformative rather than contradicted, so precision stays low (0.07–0.35).</w:t>
       </w:r>
     </w:p>
     <w:p>
@@ -1368,6 +1368,23 @@
           <w:sz w:val="24"/>
         </w:rPr>
         <w:t>The rules were re-evaluated in eight population-based ageing cohorts on three continents from raw source files with codebook-verified operationalisation (598,386 person-wave records from 285,878 participants), under a layer pre-registered before it was run (analysis plan section 19). Only 6 of 21 rules were testable; 15 required measurements absent in every cohort (five fundus imaging, one tonometry or disc grading, three geocoded exposure, three blood assays, two dietary indices, one lipid panel). Across 18 rule × cohort pairs (Figure 6): 8 replicated, 8 uninformative, 2 contradicted.</w:t>
+      </w:r>
+    </w:p>
+    <w:p>
+      <w:pPr>
+        <w:spacing w:lineRule="auto" w:line="360" w:after="0" w:before="0"/>
+        <w:ind w:firstLine="482"/>
+        <w:jc w:val="both"/>
+      </w:pPr>
+      <w:r>
+        <w:rPr>
+          <w:rFonts w:ascii="Times New Roman" w:hAnsi="Times New Roman" w:eastAsia="宋体"/>
+          <w:b w:val="0"/>
+          <w:i w:val="0"/>
+          <w:color w:val="000000"/>
+          <w:sz w:val="24"/>
+        </w:rPr>
+        <w:t>The same 18 cells were then put to the agent, which makes this the second external surface on which the full system is evaluated and the only one that asks about transport rather than association. The question is whether a rule replicates in a named population. Assuming transport — the rule layer's only available answer, since it carries no cohort information — flags all 18 cells: recall 1.00 on the 8 replicated cells, but both contradicted and all 8 uninformative cells are flagged too (precision 0.444, F1 0.615). The population-conditioned evidence gate (query = exposure + outcome + country, requiring a chunk that names that population) found such evidence for none of the 18 cells and flagged none: recall 0, precision undefined, accuracy 0.556 from abstention alone. A plain LLM asked the same question in one sentence did better than either (F1 0.667; 6 of 8 replicated cells flagged, 4 false positives), but it endorsed 1 of the 2 contradicted cells — CLHLS smoking × cataract — which is exactly the failure the rule layer was designed to prevent. The agent's evidence machinery is a within-cohort retrieval tool and does not become a transport predictor by being pointed at a population name.</w:t>
       </w:r>
     </w:p>
     <w:p>
@@ -2277,7 +2294,7 @@
           <w:color w:val="000000"/>
           <w:sz w:val="24"/>
         </w:rPr>
-        <w:t>Independence is tier-specific and the gap differs by metric: the development set contributes no independent estimate (and, on the audit above, no contamination-free positives either); internal-to-external change was 0.007 for rule testability, 0.522 to 0.360 for the rule layer and 0.571 to 0.375 for the agent, falling to 0.211 on the 296 revision-free pairs; the eight cohorts are population-independent but only 18 of 168 cells were feasible; the literature layer is index-independent but not source-independent. Estimation relies on unweighted cluster-robust variance (the pre-registered survey design could not be implemented) on anti-conservative exact tests over non-independent pairs, and on an internal-layer F1 that is an upper bound after test-set fitting. Cataract outcomes were self-reported in every layer, with examination-based NHANES measures limited to retinal grading and visual acuity; glaucoma was tested only as pressure or disc-cupping surrogates. Most waves are cross-sectional, so incidence cannot be separated from prevalent disease and selective survival cannot be tested directly. Six of eight uninformative cohort pairs were powered nulls; r11 could exclude only associations of 1.7-fold or larger. Eight rules were specified on a narrower construct than the data support (five AMD rules against any AMD, three glycaemic rules against self-reported diabetes); in the cohort layer only r02 and r11 were testable under those substitutions, and neither tests the construct its citation supports. r11 and r13 each rest on one cohort. A working interface demonstrates operability, not clinical benefit; no patient-level diagnostic accuracy, calibration or usability trial was conducted, the risk grade is a severity tier rather than a calibrated probability, and the pre-registered expert panel was not conducted (partially replaced by the four-index literature validation and a synthetic effect-injection regression). Finally, the CLHLS severe-impairment flag exceeded its plausibility band (25.7% at mean age 92); it is a secondary analysis only.</w:t>
+        <w:t>Independence is tier-specific and the gap differs by metric: the development set contributes no independent estimate (and, on the audit above, no contamination-free positives either); internal-to-external change was 0.007 for rule testability, 0.522 to 0.360 for the rule layer and 0.571 to 0.375 for the agent, falling to 0.211 on the 296 revision-free pairs; the eight cohorts are population-independent but only 18 of 168 cells were feasible; the literature layer is index-independent but not source-independent. Estimation relies on unweighted cluster-robust variance on anti-conservative exact tests over non-independent pairs, and on an internal-layer F1 that is an upper bound after test-set fitting. Cataract outcomes were self-reported in every layer, with examination-based NHANES measures limited to retinal grading and visual acuity; glaucoma was tested only as pressure or disc-cupping surrogates. Most waves are cross-sectional, so incidence cannot be separated from prevalent disease and selective survival cannot be tested directly. Six of eight uninformative cohort pairs were powered nulls; r11 could exclude only associations of 1.7-fold or larger. Eight rules were specified on a narrower construct than the data support (five AMD rules against any AMD, three glycaemic rules against self-reported diabetes); in the cohort layer only r02 and r11 were testable under those substitutions, and neither tests the construct its citation supports. r11 and r13 each rest on one cohort. A working interface demonstrates operability, not clinical benefit; no patient-level diagnostic accuracy, calibration or usability trial was conducted, the risk grade is a severity tier rather than a calibrated probability, and the pre-registered expert panel was not conducted (partially replaced by the four-index literature validation and a synthetic effect-injection regression). Finally, the CLHLS severe-impairment flag exceeded its plausibility band (25.7% at mean age 92); it is a secondary analysis only.</w:t>
       </w:r>
     </w:p>
     <w:p>
@@ -11785,7 +11802,7 @@
                 <w:color w:val="000000"/>
                 <w:sz w:val="13"/>
               </w:rPr>
-              <w:t>not assessed</w:t>
+              <w:t>0.000 (18 cells)</w:t>
             </w:r>
           </w:p>
         </w:tc>
@@ -11805,7 +11822,7 @@
                 <w:color w:val="000000"/>
                 <w:sz w:val="13"/>
               </w:rPr>
-              <w:t>not assessed</w:t>
+              <w:t>0.615 (assume transport)</w:t>
             </w:r>
           </w:p>
         </w:tc>
@@ -11825,7 +11842,7 @@
                 <w:color w:val="000000"/>
                 <w:sz w:val="13"/>
               </w:rPr>
-              <w:t>not assessed</w:t>
+              <w:t>—</w:t>
             </w:r>
           </w:p>
         </w:tc>
@@ -11845,7 +11862,7 @@
                 <w:color w:val="000000"/>
                 <w:sz w:val="13"/>
               </w:rPr>
-              <w:t>not assessed</w:t>
+              <w:t>0.667 (plain LLM)</w:t>
             </w:r>
           </w:p>
         </w:tc>
@@ -11865,7 +11882,7 @@
                 <w:color w:val="000000"/>
                 <w:sz w:val="13"/>
               </w:rPr>
-              <w:t>not assessed</w:t>
+              <w:t>—</w:t>
             </w:r>
           </w:p>
         </w:tc>
@@ -11905,7 +11922,7 @@
                 <w:color w:val="000000"/>
                 <w:sz w:val="13"/>
               </w:rPr>
-              <w:t>6 of 21 rules testable; 18 of 168 cells feasible</w:t>
+              <w:t>6 of 21 rules testable; 18 of 168 cells feasible; cell-level task = will this rule replicate in this population; the population-conditioned gate found no population-specific evidence for any cell</w:t>
             </w:r>
           </w:p>
         </w:tc>
@@ -12099,7 +12116,7 @@
           <w:color w:val="000000"/>
           <w:sz w:val="16"/>
         </w:rPr>
-        <w:t xml:space="preserve"> Baselines were recomputed under the pre-registered rule that a failed parse is missing data, never a negative (R31 addendum P0); the earlier values (0.145/0.135/0.094) treated parse failures as negative responses and are void. System-level F1 exists where the three baselines were run, which is NHANES (two generations) and KNHANES. The NHANES matrix is labeled development because all 6 of its replicated pairs are covered by rules revised after the first confirmatory run; with zero contamination-free positives it cannot support an out-of-sample estimate. KNHANES is the only external matrix on which the full agent ran end to end; there it edges past its own rule layer, and the ordering — but not the level — survives removal of the 5 revised pairs. CHARLS and the eight cohorts were evaluated at the rule level, so "not assessed" indicates a different validation target, not a missing result. R/C/U order is replicated/contradicted/uninformative rule-relevant pairs. The literature layer reports index-level precision, not F1: PubMed 0.889, Web of Science 0.916, Europe PMC 0.922 and CNKI 0.800.</w:t>
+        <w:t xml:space="preserve"> Baselines were recomputed under the pre-registered rule that a failed parse is missing data, never a negative (R31 addendum P0); the earlier values (0.145/0.135/0.094) treated parse failures as negative responses and are void. System-level F1 exists where the three baselines were run, which is NHANES (two generations) and KNHANES. The NHANES matrix is labeled development because all 6 of its replicated pairs are covered by rules revised after the first confirmatory run; with zero contamination-free positives it cannot support an out-of-sample estimate. KNHANES is the only external matrix on which the full agent ran end to end; there it edges past its own rule layer, and the ordering — but not the level — survives removal of the 5 revised pairs. CHARLS was evaluated at the rule level only, so "not assessed" there indicates a different validation target, not a missing result; the eight cohorts are reported both at the rule level (Fig 6) and, for the 18 cells, at the agent level. R/C/U order is replicated/contradicted/uninformative rule-relevant pairs. The literature layer reports index-level precision, not F1: PubMed 0.889, Web of Science 0.916, Europe PMC 0.922 and CNKI 0.800.</w:t>
       </w:r>
     </w:p>
     <w:p>

</xml_diff>

<commit_message>
R31 figure+title pass: Figure 2 rebuilt (external F1 by scope, gate decisions, provenance, three-state), contract and legend rewritten; title reframed to external gains/development-informed benchmark; cover letter rebuilt from md (builder no longer overwrites it); QC 20/20
</commit_message>
<xml_diff>
--- a/outputs/paper/manuscript_agent_first.docx
+++ b/outputs/paper/manuscript_agent_first.docx
@@ -26,7 +26,7 @@
           <w:color w:val="000000"/>
           <w:sz w:val="36"/>
         </w:rPr>
-        <w:t>An explainable rule-knowledge-graph-LLM agent for exposome-eye risk stratification: strong benchmarks, operable reports, limited rule transportability</w:t>
+        <w:t>An explainable rule-knowledge-graph-LLM agent for exposome-eye risk stratification: external gains, a development-informed benchmark, and rules that do not transport</w:t>
       </w:r>
     </w:p>
     <w:p>
@@ -1265,7 +1265,7 @@
           <w:color w:val="000000"/>
           <w:sz w:val="24"/>
         </w:rPr>
-        <w:t>At the system level the internal NHANES matrix is reported as a development description, not as performance. The 134-pair development set contributed no independent estimate, and the 80-pair matrix was itself used in development: the rule set was revised after the first confirmatory run (r02–r04 exposure coverage altered, r22 added; Methods records this as test-set fitting). The audit is decisive: of the 159-pair matrix's 6 replicated pairs, all 6 are covered by a rule that the revision touched, leaving zero contamination-free positives. Its recall of 1.000 therefore measures the revision. For completeness the numbers are: deployable full agent F1 = 0.571 (P 0.400 / R 1.000) on the 80 pairs (Qwen3.8-27B baselines, R11-corrected gold), ahead of LightRAG 0.392 ± 0.007, pure LLM 0.335 ± 0.010 and naive RAG 0.080 ± 0.110 over five seeds (Figure 2); under the earlier gold the pre-revision v1.1 set scored 0.111 (P 0.091 / R 0.143). Accuracy McNemar was significant against LightRAG (p = 0.0064–0.0117) and pure LLM (p = 0.0004–0.0013) but not naive RAG (p = 0.42–1.00). The ablation localises the gain: bare rule layer 0.522, +negative-control gate 0.545, +evidence confirmation and arbiter 0.571. The full agent extended the ordering to the 159-pair GLM-5.3-flash generation: F1 = 0.522 (P 0.353 / R 1.000) versus rule layer 0.480 and baselines 0.186, 0.178 and 0.069, with accuracy McNemar significant against all three (per-seed p &lt; 10⁻⁶). A stronger commercial LLM as a standalone judge produced more, not fewer, false positives (precision 0.10). Under a secondary binary collapse (gold positive = replicated; predicted positive = flag), the full agent reached sensitivity 1.00, specificity 0.878, PPV 0.400 and κ 0.520, every one of which inherits the constructed recall (Supplementary Table S7); naive RAG's near-null flagging (sensitivity 0–0.17, κ ≈ 0) explains its accuracy-McNemar null. The full agent flags 17 of 80 pairs against 4–31 for the baselines, and most predicted-positive pairs are uninformative rather than contradicted, so precision stays low (0.07–0.35).</w:t>
+        <w:t>At the system level the internal NHANES matrix is reported as a development description, not as performance. The 134-pair development set contributed no independent estimate, and the 80-pair matrix was itself used in development: the rule set was revised after the first confirmatory run (r02–r04 exposure coverage altered, r22 added; Methods records this as test-set fitting). The audit is decisive: of the 159-pair matrix's 6 replicated pairs, all 6 are covered by a rule that the revision touched, leaving zero contamination-free positives. Its recall of 1.000 therefore measures the revision. For completeness the numbers are: deployable full agent F1 = 0.571 (P 0.400 / R 1.000) on the 80 pairs (Qwen3.8-27B baselines, R11-corrected gold), ahead of LightRAG 0.392 ± 0.007, pure LLM 0.335 ± 0.010 and naive RAG 0.080 ± 0.110 over five seeds; under the earlier gold the pre-revision v1.1 set scored 0.111 (P 0.091 / R 0.143). Accuracy McNemar was significant against LightRAG (p = 0.0064–0.0117) and pure LLM (p = 0.0004–0.0013) but not naive RAG (p = 0.42–1.00). The ablation localises the gain: bare rule layer 0.522, +negative-control gate 0.545, +evidence confirmation and arbiter 0.571. The full agent extended the ordering to the 159-pair GLM-5.3-flash generation: F1 = 0.522 (P 0.353 / R 1.000) versus rule layer 0.480 and baselines 0.186, 0.178 and 0.069, with accuracy McNemar significant against all three (per-seed p &lt; 10⁻⁶). A stronger commercial LLM as a standalone judge produced more, not fewer, false positives (precision 0.10). Under a secondary binary collapse (gold positive = replicated; predicted positive = flag), the full agent reached sensitivity 1.00, specificity 0.878, PPV 0.400 and κ 0.520, every one of which inherits the constructed recall (Supplementary Table S7); naive RAG's near-null flagging (sensitivity 0–0.17, κ ≈ 0) explains its accuracy-McNemar null. The full agent flags 17 of 80 pairs against 4–31 for the baselines, and most predicted-positive pairs are uninformative rather than contradicted, so precision stays low (0.07–0.35).</w:t>
       </w:r>
     </w:p>
     <w:p>
@@ -1316,7 +1316,7 @@
           <w:color w:val="000000"/>
           <w:sz w:val="24"/>
         </w:rPr>
-        <w:t>On KNHANES the full agent was run end to end on all 301 testable pairs, which makes this the only agent-level external estimate, and it is also the only one that can be split into pairs the rule revision touched and pairs it did not. On all 301 pairs the agent reached F1 = 0.375 (P 0.300 / R 0.500), against its own deterministic rule layer at 0.360 (P 0.281 / R 0.500) and the three baselines at 0.176 (LightRAG), 0.173 (pure LLM) and 0.120 (naive RAG). Accuracy McNemar was significant against all three baselines before and after Benjamini-Hochberg correction over the 15 tests per matrix (q &lt; 0.001 in every case), but that test is dominated by the 277 uninformative pairs, on which abstention earns credit; F1 is the declared metric and accuracy is secondary.</w:t>
+        <w:t>On KNHANES the full agent was run end to end on all 301 testable pairs, which makes this the only agent-level external estimate, and it is also the only one that can be split into pairs the rule revision touched and pairs it did not. On all 301 pairs the agent reached F1 = 0.375 (P 0.300 / R 0.500), against its own deterministic rule layer at 0.360 (P 0.281 / R 0.500) and the three baselines at 0.176 (LightRAG), 0.173 (pure LLM) and 0.120 (naive RAG; Figure 2a). Accuracy McNemar was significant against all three baselines before and after Benjamini-Hochberg correction over the 15 tests per matrix (q &lt; 0.001 in every case), but that test is dominated by the 277 uninformative pairs, on which abstention earns credit; F1 is the declared metric and accuracy is secondary.</w:t>
       </w:r>
     </w:p>
     <w:p>
@@ -4805,7 +4805,7 @@
           <w:color w:val="000000"/>
           <w:sz w:val="22"/>
         </w:rPr>
-        <w:t>Figure 2. Huiyan (v1.2) vs three LLM baselines on NHANES pairs, in two baseline generations.</w:t>
+        <w:t>Figure 2. External performance, decision mechanism, and provenance of the positives.</w:t>
       </w:r>
     </w:p>
     <w:p>
@@ -4821,7 +4821,7 @@
           <w:color w:val="000000"/>
           <w:sz w:val="21"/>
         </w:rPr>
-        <w:t>In the primary generation (80 development-era pairs, local Qwen3.8-27B baselines, R11-corrected three-state gold under survey svyglm variance), the full Huiyan system attains F1 = 0.522 (P 0.353 / R 1.000, deterministic across seeds), ahead of lightrag 0.392 ± 0.007, pure_llm 0.335 ± 0.010 and naive_rag 0.080 ± 0.110 (5 seeds each). Accuracy McNemar is significant against pure_llm (p = 0.0043–0.0118) but not lightrag (p = 0.057–0.092, then vector-only) or naive_rag (p = 0.58–0.79); a flag-pattern McNemar on predicted positives is significant against pure_llm and naive_rag. After the LightRAG baseline was upgraded to full hybrid knowledge-graph traversal and all baselines were re-run on GLM-5.3-flash over 159 pairs, the ordering holds and the LightRAG comparison resolves: full 0.480 (P 0.316 / R 1.000) &gt; lightrag 0.186 ± 0.006 &gt; pure_llm 0.178 ± 0.015 &gt; naive_rag 0.069 ± 0.086, with accuracy McNemar significant against lightrag (p = 1.0×10⁻⁸ to 7.7×10⁻⁷) and pure_llm (p = 1.2×10⁻¹² to 5.4×10⁻⁹) but not naive_rag (p = 0.30–1.00). Precision is low for every method (0.07–0.35) because most predicted-positive pairs are uninformative under the three-state standard rather than contradicting it.</w:t>
+        <w:t>(a) F1 on the 301 KNHANES pairs and on the 296 pairs whose rules the post-confirmatory revision did not touch: agent 0.375 / 0.211, rule layer 0.360 / 0.200, LightRAG 0.176 / 0.089, pure LLM 0.173 / 0.122 and naive RAG 0.120 / 0.086. Every method loses about two thirds of its F1 when the revised pairs are removed; the ordering is unchanged.</w:t>
       </w:r>
     </w:p>
     <w:p>
@@ -4837,18 +4837,14 @@
           <w:color w:val="000000"/>
           <w:sz w:val="21"/>
         </w:rPr>
-        <w:t>(</w:t>
+        <w:t>(b) Which layer decides each of the 474 pairs in the fused run: no rule fires 418, evidence at level B or above confirms 45, the LLM arbiter 6, negative-control abstention 3 and no relevant evidence 2. The language model touches six cells.</w:t>
       </w:r>
-      <w:r>
-        <w:rPr>
-          <w:rFonts w:ascii="Times New Roman" w:hAnsi="Times New Roman" w:eastAsia="宋体"/>
-          <w:b/>
-          <w:i w:val="0"/>
-          <w:color w:val="000000"/>
-          <w:sz w:val="21"/>
-        </w:rPr>
-        <w:t>a</w:t>
-      </w:r>
+    </w:p>
+    <w:p>
+      <w:pPr>
+        <w:spacing w:line="312" w:lineRule="auto" w:after="40"/>
+        <w:jc w:val="both"/>
+      </w:pPr>
       <w:r>
         <w:rPr>
           <w:rFonts w:ascii="Times New Roman" w:hAnsi="Times New Roman" w:eastAsia="宋体"/>
@@ -4857,18 +4853,14 @@
           <w:color w:val="000000"/>
           <w:sz w:val="21"/>
         </w:rPr>
-        <w:t>) F1 by method (5 seeds; bars show the mean, whiskers are ±1 SD across seeds), two generations shown side by side. Grouped bars: blue = qwen generation (80 pairs), yellow = zhipu generation (159 pairs). qwen: full_system 0.522 (deterministic) &gt; lightrag 0.392 &gt; pure_llm 0.335 &gt; naive_rag 0.080. zhipu: full_system 0.480 (deterministic) &gt; lightrag 0.186 &gt; pure_llm 0.178 &gt; naive_rag 0.069. The two generations are not averaged: they differ in gold size and backend. The pre-expansion v1.1 ruleset (0.111 on the R5 gold) is not plotted here; see the internal-layer tables. (</w:t>
+        <w:t>(c) Replicated pairs by provenance. In the development matrix (NHANES) all 6 replicated pairs are covered by a rule that the revision touched and none is contamination-free; in the external matrix (KNHANES) 5 of the 18 replicated pairs sit on revised rules and 13 on untouched ones.</w:t>
       </w:r>
-      <w:r>
-        <w:rPr>
-          <w:rFonts w:ascii="Times New Roman" w:hAnsi="Times New Roman" w:eastAsia="宋体"/>
-          <w:b/>
-          <w:i w:val="0"/>
-          <w:color w:val="000000"/>
-          <w:sz w:val="21"/>
-        </w:rPr>
-        <w:t>b</w:t>
-      </w:r>
+    </w:p>
+    <w:p>
+      <w:pPr>
+        <w:spacing w:line="312" w:lineRule="auto" w:after="40"/>
+        <w:jc w:val="both"/>
+      </w:pPr>
       <w:r>
         <w:rPr>
           <w:rFonts w:ascii="Times New Roman" w:hAnsi="Times New Roman" w:eastAsia="宋体"/>
@@ -4877,18 +4869,14 @@
           <w:color w:val="000000"/>
           <w:sz w:val="21"/>
         </w:rPr>
-        <w:t>) Confusion matrix of the deterministic full system against the R11-corrected three-state gold on the primary 80-pair generation: predict YES 6 replicated / 0 contradicted / 11 uninformative; predict NO 0 replicated / 2 contradicted / 61 uninformative (TP 6, FP 11, FN 0, TN 63). Cell shading in (</w:t>
+        <w:t>(d) Three-state decomposition on the 301 pairs. The agent and the rule layer recall the same 0.50 of replicated pairs and flag the same 0.17 of contradicted pairs; they differ only on uninformative pairs (0.07 versus 0.08). The gate is therefore a precision instrument, not a recall instrument.</w:t>
       </w:r>
-      <w:r>
-        <w:rPr>
-          <w:rFonts w:ascii="Times New Roman" w:hAnsi="Times New Roman" w:eastAsia="宋体"/>
-          <w:b/>
-          <w:i w:val="0"/>
-          <w:color w:val="000000"/>
-          <w:sz w:val="21"/>
-        </w:rPr>
-        <w:t>b</w:t>
-      </w:r>
+    </w:p>
+    <w:p>
+      <w:pPr>
+        <w:spacing w:line="312" w:lineRule="auto" w:after="40"/>
+        <w:jc w:val="both"/>
+      </w:pPr>
       <w:r>
         <w:rPr>
           <w:rFonts w:ascii="Times New Roman" w:hAnsi="Times New Roman" w:eastAsia="宋体"/>
@@ -4897,18 +4885,14 @@
           <w:color w:val="000000"/>
           <w:sz w:val="21"/>
         </w:rPr>
-        <w:t>) is a visual aid only; every count is printed in its cell. (</w:t>
+        <w:t>Statistics: unit = (exposure flag, outcome item) pair; gold = three-state label under survey variance; baselines recomputed with failed parses treated as missing rather than negative (R31 addendum P0); F1 for baselines is the mean over five seeds (11, 22, 33, 44, 55), agent and rule layer are deterministic; paired McNemar on accuracy, Benjamini-Hochberg corrected over the 15 tests per matrix (q &lt; 0.001).</w:t>
       </w:r>
-      <w:r>
-        <w:rPr>
-          <w:rFonts w:ascii="Times New Roman" w:hAnsi="Times New Roman" w:eastAsia="宋体"/>
-          <w:b/>
-          <w:i w:val="0"/>
-          <w:color w:val="000000"/>
-          <w:sz w:val="21"/>
-        </w:rPr>
-        <w:t>c</w:t>
-      </w:r>
+    </w:p>
+    <w:p>
+      <w:pPr>
+        <w:spacing w:line="312" w:lineRule="auto" w:after="40"/>
+        <w:jc w:val="both"/>
+      </w:pPr>
       <w:r>
         <w:rPr>
           <w:rFonts w:ascii="Times New Roman" w:hAnsi="Times New Roman" w:eastAsia="宋体"/>
@@ -4917,59 +4901,7 @@
           <w:color w:val="000000"/>
           <w:sz w:val="21"/>
         </w:rPr>
-        <w:t>) Rule-layer coverage and declared-domain precision in NHANES (internal) versus KNHANES (external), shown as grouped bars: coverage 0.889 versus 0.882, precision_rule 1.00 versus 1.00. (</w:t>
-      </w:r>
-      <w:r>
-        <w:rPr>
-          <w:rFonts w:ascii="Times New Roman" w:hAnsi="Times New Roman" w:eastAsia="宋体"/>
-          <w:b/>
-          <w:i w:val="0"/>
-          <w:color w:val="000000"/>
-          <w:sz w:val="21"/>
-        </w:rPr>
-        <w:t>d</w:t>
-      </w:r>
-      <w:r>
-        <w:rPr>
-          <w:rFonts w:ascii="Times New Roman" w:hAnsi="Times New Roman" w:eastAsia="宋体"/>
-          <w:b w:val="0"/>
-          <w:i w:val="0"/>
-          <w:color w:val="000000"/>
-          <w:sz w:val="21"/>
-        </w:rPr>
-        <w:t>) Distribution of retrieved KG context size for the qwen-generation LightRAG baseline (5 seeds × 80 pairs, characters); it documents how much context the retrieval baseline received and is not a performance claim.</w:t>
-      </w:r>
-    </w:p>
-    <w:p>
-      <w:pPr>
-        <w:spacing w:line="312" w:lineRule="auto" w:after="40"/>
-        <w:jc w:val="both"/>
-      </w:pPr>
-      <w:r>
-        <w:rPr>
-          <w:rFonts w:ascii="Times New Roman" w:hAnsi="Times New Roman" w:eastAsia="宋体"/>
-          <w:b w:val="0"/>
-          <w:i w:val="0"/>
-          <w:color w:val="000000"/>
-          <w:sz w:val="21"/>
-        </w:rPr>
-        <w:t>Statistics: NHANES tested pairs; gold = three-state labels under survey svyglm variance after the R11 operationalisation corrections; 5 seeds per method; full_system is deterministic and all five runs are identical; paired McNemar exact; * p&lt;0.05; n.s. p&gt;=0.057 in the qwen generation versus lightrag.</w:t>
-      </w:r>
-    </w:p>
-    <w:p>
-      <w:pPr>
-        <w:spacing w:line="312" w:lineRule="auto" w:after="40"/>
-        <w:jc w:val="both"/>
-      </w:pPr>
-      <w:r>
-        <w:rPr>
-          <w:rFonts w:ascii="Times New Roman" w:hAnsi="Times New Roman" w:eastAsia="宋体"/>
-          <w:b w:val="0"/>
-          <w:i w:val="0"/>
-          <w:color w:val="000000"/>
-          <w:sz w:val="21"/>
-        </w:rPr>
-        <w:t>Abbreviations: F1 = F1 score; P = precision; R = recall; KG = knowledge graph; LLM = large language model; NHANES = National Health and Nutrition Examination Survey; KNHANES = Korea National Health and Nutrition Examination Survey; R5/R11 = internal analysis revisions (gold-label versions); SD = standard deviation; n.s. = not significant.</w:t>
+        <w:t>Abbreviations: F1 = F1 score; G0 = rule layer; G2 = deployable agent (rule layer + negative-control gate + evidence confirmation + arbiter); KNHANES = Korea National Health and Nutrition Examination Survey; NHANES = National Health and Nutrition Examination Survey; RAG = retrieval-augmented generation.</w:t>
       </w:r>
     </w:p>
     <w:p>
@@ -13707,7 +13639,7 @@
       <w:r>
         <w:drawing>
           <wp:inline xmlns:a="http://schemas.openxmlformats.org/drawingml/2006/main" xmlns:pic="http://schemas.openxmlformats.org/drawingml/2006/picture">
-            <wp:extent cx="5544000" cy="4046569"/>
+            <wp:extent cx="5544000" cy="3786805"/>
             <wp:docPr id="2" name="Picture 2"/>
             <wp:cNvGraphicFramePr>
               <a:graphicFrameLocks noChangeAspect="1"/>
@@ -13728,7 +13660,7 @@
                   <pic:spPr>
                     <a:xfrm>
                       <a:off x="0" y="0"/>
-                      <a:ext cx="5544000" cy="4046569"/>
+                      <a:ext cx="5544000" cy="3786805"/>
                     </a:xfrm>
                     <a:prstGeom prst="rect"/>
                   </pic:spPr>
@@ -13762,7 +13694,7 @@
           <w:color w:val="000000"/>
           <w:sz w:val="19"/>
         </w:rPr>
-        <w:t>Huiyan (v1.2) vs three LLM baselines on NHANES pairs, in two baseline generations.</w:t>
+        <w:t>External performance, decision mechanism, and provenance of the positives.</w:t>
       </w:r>
     </w:p>
     <w:p>

</xml_diff>